<commit_message>
Fix resume formatting (clean 2-page layout)
</commit_message>
<xml_diff>
--- a/assets/AD_Annas_Resume.docx
+++ b/assets/AD_Annas_Resume.docx
@@ -37,35 +37,25 @@
         <w:t xml:space="preserve"> </w:t>
       </w:r>
       <w:r>
-        <w:t xml:space="preserve">Troutman, NC (Remote)</w:t>
-      </w:r>
-      <w:r>
-        <w:t xml:space="preserve"> </w:t>
-      </w:r>
-      <w:r>
-        <w:t xml:space="preserve">(704) 604-9093 |</w:t>
-      </w:r>
-      <w:r>
-        <w:t xml:space="preserve"> </w:t>
-      </w:r>
-      <w:r>
-        <w:t xml:space="preserve">aarondanielannas@gmail.com</w:t>
-      </w:r>
-      <w:r>
-        <w:t xml:space="preserve"> </w:t>
-      </w:r>
-      <w:r>
-        <w:t xml:space="preserve">|</w:t>
-      </w:r>
-      <w:r>
-        <w:t xml:space="preserve"> </w:t>
-      </w:r>
-      <w:r>
-        <w:t xml:space="preserve">www.aarondanielannas.com</w:t>
-      </w:r>
-      <w:r>
-        <w:t xml:space="preserve"> </w:t>
-      </w:r>
+        <w:t xml:space="preserve">Troutman, NC (Remote) • (704) 604-9093 • aarondanielannas@gmail.com</w:t>
+      </w:r>
+      <w:r>
+        <w:t xml:space="preserve"> </w:t>
+      </w:r>
+      <w:r>
+        <w:t xml:space="preserve">www.aarondanielannas.com • LinkedIn: linkedin.com/in/aaron-daniel-annas-6403a417</w:t>
+      </w:r>
+      <w:r>
+        <w:t xml:space="preserve"> </w:t>
+      </w:r>
+      <w:r>
+        <w:t xml:space="preserve">IMDb: imdb.com/name/nm4644428 • FilmFreeway: filmfreeway.com/AaronDanielAnnas</w:t>
+      </w:r>
+    </w:p>
+    <w:p>
+      <w:pPr>
+        <w:pStyle w:val="BodyText"/>
+      </w:pPr>
       <w:r>
         <w:t xml:space="preserve">EXECUTIVE SUMMARY</w:t>
       </w:r>
@@ -75,9 +65,11 @@
       <w:r>
         <w:t xml:space="preserve">Creative leader and award-winning filmmaker with 10+ years of experience developing and executing story-driven content across documentary, broadcast, and digital platforms. Proven ability to lead teams, shape narrative strategy, and deliver compelling content that engages audiences and supports mission-driven goals. Experienced across directing, editing, and post-production leadership, with a strong understanding of how content strategy, storytelling, and distribution align to reach and engage audiences.</w:t>
       </w:r>
-      <w:r>
-        <w:t xml:space="preserve"> </w:t>
-      </w:r>
+    </w:p>
+    <w:p>
+      <w:pPr>
+        <w:pStyle w:val="BodyText"/>
+      </w:pPr>
       <w:r>
         <w:t xml:space="preserve">CORE STRENGTHS</w:t>
       </w:r>
@@ -85,53 +77,55 @@
         <w:t xml:space="preserve"> </w:t>
       </w:r>
       <w:r>
-        <w:t xml:space="preserve">Creative Direction &amp; Storytelling</w:t>
-      </w:r>
-      <w:r>
-        <w:t xml:space="preserve"> </w:t>
-      </w:r>
-      <w:r>
-        <w:t xml:space="preserve">Content Strategy &amp; Multi-Platform Media</w:t>
-      </w:r>
-      <w:r>
-        <w:t xml:space="preserve"> </w:t>
-      </w:r>
-      <w:r>
-        <w:t xml:space="preserve">Video Production (Pre-Post Pipeline)</w:t>
-      </w:r>
-      <w:r>
-        <w:t xml:space="preserve"> </w:t>
-      </w:r>
-      <w:r>
-        <w:t xml:space="preserve">Team Leadership &amp; Collaboration</w:t>
-      </w:r>
-      <w:r>
-        <w:t xml:space="preserve"> </w:t>
-      </w:r>
-      <w:r>
-        <w:t xml:space="preserve">Narrative Development &amp; Audience Engagement</w:t>
-      </w:r>
-      <w:r>
-        <w:t xml:space="preserve"> </w:t>
-      </w:r>
-      <w:r>
-        <w:t xml:space="preserve">Editorial Oversight &amp; Post-Production</w:t>
-      </w:r>
-      <w:r>
-        <w:t xml:space="preserve"> </w:t>
-      </w:r>
-      <w:r>
-        <w:t xml:space="preserve">Media Workflows &amp; Systems</w:t>
-      </w:r>
-      <w:r>
-        <w:t xml:space="preserve"> </w:t>
-      </w:r>
-      <w:r>
-        <w:t xml:space="preserve">AI in Media Production</w:t>
-      </w:r>
-      <w:r>
-        <w:t xml:space="preserve"> </w:t>
-      </w:r>
+        <w:t xml:space="preserve">• Creative Direction &amp; Storytelling</w:t>
+      </w:r>
+      <w:r>
+        <w:t xml:space="preserve"> </w:t>
+      </w:r>
+      <w:r>
+        <w:t xml:space="preserve">• Content Strategy &amp; Multi-Platform Media</w:t>
+      </w:r>
+      <w:r>
+        <w:t xml:space="preserve"> </w:t>
+      </w:r>
+      <w:r>
+        <w:t xml:space="preserve">• Video Production (Pre-Post Pipeline)</w:t>
+      </w:r>
+      <w:r>
+        <w:t xml:space="preserve"> </w:t>
+      </w:r>
+      <w:r>
+        <w:t xml:space="preserve">• Team Leadership &amp; Collaboration</w:t>
+      </w:r>
+      <w:r>
+        <w:t xml:space="preserve"> </w:t>
+      </w:r>
+      <w:r>
+        <w:t xml:space="preserve">• Narrative Development &amp; Audience Engagement</w:t>
+      </w:r>
+      <w:r>
+        <w:t xml:space="preserve"> </w:t>
+      </w:r>
+      <w:r>
+        <w:t xml:space="preserve">• Editorial Oversight &amp; Post-Production</w:t>
+      </w:r>
+      <w:r>
+        <w:t xml:space="preserve"> </w:t>
+      </w:r>
+      <w:r>
+        <w:t xml:space="preserve">• Media Workflows &amp; Systems</w:t>
+      </w:r>
+      <w:r>
+        <w:t xml:space="preserve"> </w:t>
+      </w:r>
+      <w:r>
+        <w:t xml:space="preserve">• AI in Media Production</w:t>
+      </w:r>
+    </w:p>
+    <w:p>
+      <w:pPr>
+        <w:pStyle w:val="BodyText"/>
+      </w:pPr>
       <w:r>
         <w:t xml:space="preserve">PROFESSIONAL EXPERIENCE</w:t>
       </w:r>
@@ -139,173 +133,157 @@
         <w:t xml:space="preserve"> </w:t>
       </w:r>
       <w:r>
-        <w:t xml:space="preserve">Catawba College — Chair &amp; Associate Professor, Communication Arts and Media</w:t>
-      </w:r>
-      <w:r>
-        <w:t xml:space="preserve"> </w:t>
-      </w:r>
-      <w:r>
-        <w:t xml:space="preserve">2024–Present</w:t>
-      </w:r>
-      <w:r>
-        <w:t xml:space="preserve"> </w:t>
-      </w:r>
-      <w:r>
-        <w:t xml:space="preserve">Lead a multidisciplinary media program, overseeing creative direction, production workflows, and team development across video and digital content</w:t>
-      </w:r>
-      <w:r>
-        <w:t xml:space="preserve"> </w:t>
-      </w:r>
-      <w:r>
-        <w:t xml:space="preserve">Direct and supervise documentary and narrative projects from concept through distribution</w:t>
-      </w:r>
-      <w:r>
-        <w:t xml:space="preserve"> </w:t>
-      </w:r>
-      <w:r>
-        <w:t xml:space="preserve">Manage teams of collaborators across writing, production, and post-production</w:t>
-      </w:r>
-      <w:r>
-        <w:t xml:space="preserve"> </w:t>
-      </w:r>
-      <w:r>
-        <w:t xml:space="preserve">Develop structured workflows for planning, production, editing, and delivery</w:t>
-      </w:r>
-      <w:r>
-        <w:t xml:space="preserve"> </w:t>
-      </w:r>
-      <w:r>
-        <w:t xml:space="preserve">Manage budgets, equipment systems, and external creative partnerships</w:t>
-      </w:r>
-      <w:r>
-        <w:t xml:space="preserve"> </w:t>
-      </w:r>
-      <w:r>
-        <w:t xml:space="preserve">Integrate emerging tools, including AI, into production processes</w:t>
-      </w:r>
-      <w:r>
-        <w:t xml:space="preserve"> </w:t>
-      </w:r>
-      <w:r>
-        <w:t xml:space="preserve">Translate institutional priorities into story-driven content and messaging that supports recruitment, engagement, and program visibility</w:t>
-      </w:r>
-      <w:r>
-        <w:t xml:space="preserve"> </w:t>
-      </w:r>
-      <w:r>
-        <w:t xml:space="preserve">SUNY Buffalo State University — Director, Television &amp; Film Arts Program / Associate Professor</w:t>
-      </w:r>
-      <w:r>
-        <w:t xml:space="preserve"> </w:t>
-      </w:r>
-      <w:r>
-        <w:t xml:space="preserve">2018–2024</w:t>
-      </w:r>
-      <w:r>
-        <w:t xml:space="preserve"> </w:t>
-      </w:r>
-      <w:r>
-        <w:t xml:space="preserve">Led program operations and creative production strategy across multiple media projects</w:t>
-      </w:r>
-      <w:r>
-        <w:t xml:space="preserve"> </w:t>
-      </w:r>
-      <w:r>
-        <w:t xml:space="preserve">Supervised production teams and post-production pipelines</w:t>
-      </w:r>
-      <w:r>
-        <w:t xml:space="preserve"> </w:t>
-      </w:r>
-      <w:r>
-        <w:t xml:space="preserve">Served as Academic Supervisor for the Buffalo/Niagara Film Office, supporting regional media production and partnerships</w:t>
-      </w:r>
-      <w:r>
-        <w:t xml:space="preserve"> </w:t>
-      </w:r>
-      <w:r>
-        <w:t xml:space="preserve">Managed shared media infrastructure including Avid systems and collaborative workflows</w:t>
-      </w:r>
-      <w:r>
-        <w:t xml:space="preserve"> </w:t>
-      </w:r>
-      <w:r>
-        <w:t xml:space="preserve">Directed SUNYWide Film Festival, overseeing programming and execution</w:t>
-      </w:r>
-      <w:r>
-        <w:t xml:space="preserve"> </w:t>
-      </w:r>
-      <w:r>
-        <w:t xml:space="preserve">Led content and storytelling initiatives that supported program growth, audience engagement, and external partnerships</w:t>
-      </w:r>
-      <w:r>
-        <w:t xml:space="preserve"> </w:t>
-      </w:r>
-      <w:r>
-        <w:t xml:space="preserve">Vanguard University — Assistant Professor, Cinema Arts</w:t>
-      </w:r>
-      <w:r>
-        <w:t xml:space="preserve"> </w:t>
-      </w:r>
-      <w:r>
-        <w:t xml:space="preserve">2012–2015</w:t>
-      </w:r>
-      <w:r>
-        <w:t xml:space="preserve"> </w:t>
-      </w:r>
-      <w:r>
-        <w:t xml:space="preserve">Taught and supervised production-focused coursework in cinematography, editing, and storytelling</w:t>
-      </w:r>
-      <w:r>
-        <w:t xml:space="preserve"> </w:t>
-      </w:r>
-      <w:r>
-        <w:t xml:space="preserve">Led international experiential learning programs focused on film production and industry engagement</w:t>
-      </w:r>
-      <w:r>
-        <w:t xml:space="preserve"> </w:t>
-      </w:r>
-      <w:r>
-        <w:t xml:space="preserve">Independent Work — Filmmaker, Editor &amp; Creative Lead</w:t>
-      </w:r>
-      <w:r>
-        <w:t xml:space="preserve"> </w:t>
-      </w:r>
-      <w:r>
-        <w:t xml:space="preserve">Ongoing</w:t>
-      </w:r>
-      <w:r>
-        <w:t xml:space="preserve"> </w:t>
-      </w:r>
-      <w:r>
-        <w:t xml:space="preserve">Directed and edited independent documentary and narrative projects, including feature-length work</w:t>
-      </w:r>
-      <w:r>
-        <w:t xml:space="preserve"> </w:t>
-      </w:r>
-      <w:r>
-        <w:t xml:space="preserve">Contributed to nationally and internationally distributed productions in roles including editor, associate producer, and post-production support across networks such as National Geographic and History Channel</w:t>
-      </w:r>
-      <w:r>
-        <w:t xml:space="preserve"> </w:t>
-      </w:r>
-      <w:r>
-        <w:t xml:space="preserve">Managed production workflows including editing, visual effects, and finishing processes</w:t>
-      </w:r>
-      <w:r>
-        <w:t xml:space="preserve"> </w:t>
-      </w:r>
-      <w:r>
-        <w:t xml:space="preserve">Developed human-centered storytelling approaches that translate complex topics into engaging narratives</w:t>
-      </w:r>
-      <w:r>
-        <w:t xml:space="preserve"> </w:t>
-      </w:r>
-      <w:r>
-        <w:t xml:space="preserve">Developed and delivered content across platforms with attention to audience engagement, distribution strategy, and narrative clarity</w:t>
-      </w:r>
-      <w:r>
-        <w:t xml:space="preserve"> </w:t>
-      </w:r>
+        <w:t xml:space="preserve">Catawba College | Chair &amp; Associate Professor, Communication Arts and Media | 2024–Present</w:t>
+      </w:r>
+      <w:r>
+        <w:t xml:space="preserve"> </w:t>
+      </w:r>
+      <w:r>
+        <w:t xml:space="preserve">• Lead a multidisciplinary media program, overseeing creative direction, production workflows, and team development across video and digital content</w:t>
+      </w:r>
+      <w:r>
+        <w:t xml:space="preserve"> </w:t>
+      </w:r>
+      <w:r>
+        <w:t xml:space="preserve">• Direct and supervise documentary and narrative projects from concept through distribution</w:t>
+      </w:r>
+      <w:r>
+        <w:t xml:space="preserve"> </w:t>
+      </w:r>
+      <w:r>
+        <w:t xml:space="preserve">• Manage teams of collaborators across writing, production, and post-production</w:t>
+      </w:r>
+      <w:r>
+        <w:t xml:space="preserve"> </w:t>
+      </w:r>
+      <w:r>
+        <w:t xml:space="preserve">• Develop structured workflows for planning, production, editing, and delivery</w:t>
+      </w:r>
+      <w:r>
+        <w:t xml:space="preserve"> </w:t>
+      </w:r>
+      <w:r>
+        <w:t xml:space="preserve">• Manage budgets, equipment systems, and external creative partnerships</w:t>
+      </w:r>
+      <w:r>
+        <w:t xml:space="preserve"> </w:t>
+      </w:r>
+      <w:r>
+        <w:t xml:space="preserve">• Integrate emerging tools, including AI, into production processes</w:t>
+      </w:r>
+      <w:r>
+        <w:t xml:space="preserve"> </w:t>
+      </w:r>
+      <w:r>
+        <w:t xml:space="preserve">• Translate institutional priorities into story-driven content and messaging that supports recruitment, engagement, and program visibility</w:t>
+      </w:r>
+    </w:p>
+    <w:p>
+      <w:pPr>
+        <w:pStyle w:val="BodyText"/>
+      </w:pPr>
+      <w:r>
+        <w:t xml:space="preserve">SUNY Buffalo State University | Director, Television &amp; Film Arts Program / Associate Professor | 2018–2024</w:t>
+      </w:r>
+      <w:r>
+        <w:t xml:space="preserve"> </w:t>
+      </w:r>
+      <w:r>
+        <w:t xml:space="preserve">• Led program operations and creative production strategy across multiple media projects</w:t>
+      </w:r>
+      <w:r>
+        <w:t xml:space="preserve"> </w:t>
+      </w:r>
+      <w:r>
+        <w:t xml:space="preserve">• Supervised production teams and post-production pipelines</w:t>
+      </w:r>
+      <w:r>
+        <w:t xml:space="preserve"> </w:t>
+      </w:r>
+      <w:r>
+        <w:t xml:space="preserve">• Served as Academic Supervisor for the Buffalo/Niagara Film Office, supporting regional media production and partnerships</w:t>
+      </w:r>
+      <w:r>
+        <w:t xml:space="preserve"> </w:t>
+      </w:r>
+      <w:r>
+        <w:t xml:space="preserve">• Managed shared media infrastructure including Avid systems and collaborative workflows</w:t>
+      </w:r>
+      <w:r>
+        <w:t xml:space="preserve"> </w:t>
+      </w:r>
+      <w:r>
+        <w:t xml:space="preserve">• Directed SUNYWide Film Festival, overseeing programming and execution</w:t>
+      </w:r>
+      <w:r>
+        <w:t xml:space="preserve"> </w:t>
+      </w:r>
+      <w:r>
+        <w:t xml:space="preserve">• Led content and storytelling initiatives that supported program growth, audience engagement, and external partnerships</w:t>
+      </w:r>
+    </w:p>
+    <w:p>
+      <w:pPr>
+        <w:pStyle w:val="BodyText"/>
+      </w:pPr>
+      <w:r>
+        <w:t xml:space="preserve">Vanguard University | Assistant Professor, Cinema Arts | 2012–2015</w:t>
+      </w:r>
+      <w:r>
+        <w:t xml:space="preserve"> </w:t>
+      </w:r>
+      <w:r>
+        <w:t xml:space="preserve">• Taught and supervised production-focused coursework in cinematography, editing, and storytelling</w:t>
+      </w:r>
+      <w:r>
+        <w:t xml:space="preserve"> </w:t>
+      </w:r>
+      <w:r>
+        <w:t xml:space="preserve">• Led international experiential learning programs focused on film production and industry engagement</w:t>
+      </w:r>
+    </w:p>
+    <w:p>
+      <w:pPr>
+        <w:pStyle w:val="BodyText"/>
+      </w:pPr>
+      <w:r>
+        <w:t xml:space="preserve">Independent Work | Filmmaker, Editor &amp; Creative Lead | Ongoing</w:t>
+      </w:r>
+      <w:r>
+        <w:t xml:space="preserve"> </w:t>
+      </w:r>
+      <w:r>
+        <w:t xml:space="preserve">• Directed and edited independent documentary and narrative projects, including feature-length work</w:t>
+      </w:r>
+      <w:r>
+        <w:t xml:space="preserve"> </w:t>
+      </w:r>
+      <w:r>
+        <w:t xml:space="preserve">• Contributed to nationally and internationally distributed productions in roles including editor, associate producer, and post-production support across networks such as National Geographic and History Channel</w:t>
+      </w:r>
+      <w:r>
+        <w:t xml:space="preserve"> </w:t>
+      </w:r>
+      <w:r>
+        <w:t xml:space="preserve">• Managed production workflows including editing, visual effects, and finishing processes</w:t>
+      </w:r>
+      <w:r>
+        <w:t xml:space="preserve"> </w:t>
+      </w:r>
+      <w:r>
+        <w:t xml:space="preserve">• Developed human-centered storytelling approaches that translate complex topics into engaging narratives</w:t>
+      </w:r>
+      <w:r>
+        <w:t xml:space="preserve"> </w:t>
+      </w:r>
+      <w:r>
+        <w:t xml:space="preserve">• Developed and delivered content across platforms with attention to audience engagement, distribution strategy, and narrative clarity</w:t>
+      </w:r>
+    </w:p>
+    <w:p>
+      <w:pPr>
+        <w:pStyle w:val="BodyText"/>
+      </w:pPr>
       <w:r>
         <w:t xml:space="preserve">SELECTED PROJECTS</w:t>
       </w:r>
@@ -313,95 +291,79 @@
         <w:t xml:space="preserve"> </w:t>
       </w:r>
       <w:r>
-        <w:t xml:space="preserve">Life In the Gap</w:t>
-      </w:r>
-      <w:r>
-        <w:t xml:space="preserve"> </w:t>
-      </w:r>
-      <w:r>
-        <w:t xml:space="preserve">Director</w:t>
-      </w:r>
-      <w:r>
-        <w:t xml:space="preserve"> </w:t>
-      </w:r>
-      <w:r>
-        <w:t xml:space="preserve">Documentary exploring economic inequality through personal storytelling</w:t>
-      </w:r>
-      <w:r>
-        <w:t xml:space="preserve"> </w:t>
-      </w:r>
-      <w:r>
-        <w:t xml:space="preserve">Broadcast on PBS North Carolina and screened at festivals, engaging audiences around real-world economic challenges through human-centered storytelling</w:t>
-      </w:r>
-      <w:r>
-        <w:t xml:space="preserve"> </w:t>
-      </w:r>
-      <w:r>
-        <w:t xml:space="preserve">There’s No Such Thing as Ghosts?</w:t>
-      </w:r>
-      <w:r>
-        <w:t xml:space="preserve"> </w:t>
-      </w:r>
-      <w:r>
-        <w:t xml:space="preserve">Director &amp; Editor</w:t>
-      </w:r>
-      <w:r>
-        <w:t xml:space="preserve"> </w:t>
-      </w:r>
-      <w:r>
-        <w:t xml:space="preserve">Feature documentary with international distribution across major streaming platforms including Apple TV, Amazon Prime Video, and Tubi, reaching broad digital audiences</w:t>
-      </w:r>
-      <w:r>
-        <w:t xml:space="preserve"> </w:t>
-      </w:r>
-      <w:r>
-        <w:t xml:space="preserve">Award-winning project demonstrating strong narrative development and audience engagement</w:t>
-      </w:r>
-      <w:r>
-        <w:t xml:space="preserve"> </w:t>
-      </w:r>
-      <w:r>
-        <w:t xml:space="preserve">Reaching broad digital audiences across major streaming platforms</w:t>
-      </w:r>
-      <w:r>
-        <w:t xml:space="preserve"> </w:t>
-      </w:r>
-      <w:r>
-        <w:t xml:space="preserve">There is Many Like Us</w:t>
-      </w:r>
-      <w:r>
-        <w:t xml:space="preserve"> </w:t>
-      </w:r>
-      <w:r>
-        <w:t xml:space="preserve">Associate Producer &amp; Editor</w:t>
-      </w:r>
-      <w:r>
-        <w:t xml:space="preserve"> </w:t>
-      </w:r>
-      <w:r>
-        <w:t xml:space="preserve">Feature documentary distributed internationally via broadcast and streaming</w:t>
-      </w:r>
-      <w:r>
-        <w:t xml:space="preserve"> </w:t>
-      </w:r>
-      <w:r>
-        <w:t xml:space="preserve">Inside World War II</w:t>
-      </w:r>
-      <w:r>
-        <w:t xml:space="preserve"> </w:t>
-      </w:r>
-      <w:r>
-        <w:t xml:space="preserve">Associate Editor / SFX Design</w:t>
-      </w:r>
-      <w:r>
-        <w:t xml:space="preserve"> </w:t>
-      </w:r>
-      <w:r>
-        <w:t xml:space="preserve">Broadcast documentary for National Geographic Channel</w:t>
-      </w:r>
-      <w:r>
-        <w:t xml:space="preserve"> </w:t>
-      </w:r>
+        <w:t xml:space="preserve">Life in the Gap | Director</w:t>
+      </w:r>
+      <w:r>
+        <w:t xml:space="preserve"> </w:t>
+      </w:r>
+      <w:r>
+        <w:t xml:space="preserve">• Documentary exploring economic inequality through personal storytelling</w:t>
+      </w:r>
+      <w:r>
+        <w:t xml:space="preserve"> </w:t>
+      </w:r>
+      <w:r>
+        <w:t xml:space="preserve">• Broadcast on PBS North Carolina and screened at festivals, engaging audiences around real-world economic challenges through human-centered storytelling</w:t>
+      </w:r>
+    </w:p>
+    <w:p>
+      <w:pPr>
+        <w:pStyle w:val="BodyText"/>
+      </w:pPr>
+      <w:r>
+        <w:t xml:space="preserve">There’s No Such Thing as Ghosts? | Director &amp; Editor</w:t>
+      </w:r>
+      <w:r>
+        <w:t xml:space="preserve"> </w:t>
+      </w:r>
+      <w:r>
+        <w:t xml:space="preserve">• Feature documentary with international distribution across major streaming platforms including Apple TV, Amazon Prime Video, and Tubi, reaching broad digital audiences</w:t>
+      </w:r>
+      <w:r>
+        <w:t xml:space="preserve"> </w:t>
+      </w:r>
+      <w:r>
+        <w:t xml:space="preserve">• Award-winning project demonstrating strong narrative development and audience engagement</w:t>
+      </w:r>
+      <w:r>
+        <w:t xml:space="preserve"> </w:t>
+      </w:r>
+      <w:r>
+        <w:t xml:space="preserve">• Reaching broad digital audiences across major streaming platforms</w:t>
+      </w:r>
+    </w:p>
+    <w:p>
+      <w:pPr>
+        <w:pStyle w:val="BodyText"/>
+      </w:pPr>
+      <w:r>
+        <w:t xml:space="preserve">There is Many Like Us | Associate Producer &amp; Editor</w:t>
+      </w:r>
+      <w:r>
+        <w:t xml:space="preserve"> </w:t>
+      </w:r>
+      <w:r>
+        <w:t xml:space="preserve">• Feature documentary distributed internationally via broadcast and streaming</w:t>
+      </w:r>
+    </w:p>
+    <w:p>
+      <w:pPr>
+        <w:pStyle w:val="BodyText"/>
+      </w:pPr>
+      <w:r>
+        <w:t xml:space="preserve">Inside World War II | Associate Editor / SFX Design</w:t>
+      </w:r>
+      <w:r>
+        <w:t xml:space="preserve"> </w:t>
+      </w:r>
+      <w:r>
+        <w:t xml:space="preserve">• Broadcast documentary for National Geographic Channel</w:t>
+      </w:r>
+    </w:p>
+    <w:p>
+      <w:pPr>
+        <w:pStyle w:val="BodyText"/>
+      </w:pPr>
       <w:r>
         <w:t xml:space="preserve">EDUCATION</w:t>
       </w:r>
@@ -409,29 +371,19 @@
         <w:t xml:space="preserve"> </w:t>
       </w:r>
       <w:r>
-        <w:t xml:space="preserve">MFA, Independent Film and Digital Imaging</w:t>
-      </w:r>
-      <w:r>
-        <w:t xml:space="preserve"> </w:t>
-      </w:r>
-      <w:r>
-        <w:t xml:space="preserve">Governors State University</w:t>
-      </w:r>
-      <w:r>
-        <w:t xml:space="preserve"> </w:t>
-      </w:r>
-      <w:r>
-        <w:t xml:space="preserve">BFA, Musical Theatre</w:t>
-      </w:r>
-      <w:r>
-        <w:t xml:space="preserve"> </w:t>
-      </w:r>
-      <w:r>
-        <w:t xml:space="preserve">Mars Hill University</w:t>
-      </w:r>
-      <w:r>
-        <w:t xml:space="preserve"> </w:t>
-      </w:r>
+        <w:t xml:space="preserve">MFA, Independent Film and Digital Imaging, Governors State University</w:t>
+      </w:r>
+      <w:r>
+        <w:t xml:space="preserve"> </w:t>
+      </w:r>
+      <w:r>
+        <w:t xml:space="preserve">BFA, Musical Theatre, Mars Hill University</w:t>
+      </w:r>
+    </w:p>
+    <w:p>
+      <w:pPr>
+        <w:pStyle w:val="BodyText"/>
+      </w:pPr>
       <w:r>
         <w:t xml:space="preserve">TECHNICAL SKILLS</w:t>
       </w:r>
@@ -439,31 +391,13 @@
         <w:t xml:space="preserve"> </w:t>
       </w:r>
       <w:r>
-        <w:t xml:space="preserve">Avid Media Composer (Certified)</w:t>
-      </w:r>
-      <w:r>
-        <w:t xml:space="preserve"> </w:t>
-      </w:r>
-      <w:r>
-        <w:t xml:space="preserve">Adobe Creative Suite (Premiere Pro, After Effects, Photoshop)</w:t>
-      </w:r>
-      <w:r>
-        <w:t xml:space="preserve"> </w:t>
-      </w:r>
-      <w:r>
-        <w:t xml:space="preserve">Pro Tools</w:t>
-      </w:r>
-      <w:r>
-        <w:t xml:space="preserve"> </w:t>
-      </w:r>
-      <w:r>
-        <w:t xml:space="preserve">Avid NEXUS / Interplay systems</w:t>
-      </w:r>
-      <w:r>
-        <w:t xml:space="preserve"> </w:t>
-      </w:r>
-      <w:r>
-        <w:t xml:space="preserve">Media workflows, post-production pipelines, and compression</w:t>
+        <w:t xml:space="preserve">Avid Media Composer (Certified) • Adobe Creative Suite (Premiere Pro, After Effects, Photoshop) • Pro Tools</w:t>
+      </w:r>
+      <w:r>
+        <w:t xml:space="preserve"> </w:t>
+      </w:r>
+      <w:r>
+        <w:t xml:space="preserve">Avid NEXUS / Interplay systems • Media workflows, post-production pipelines, and compression</w:t>
       </w:r>
     </w:p>
     <w:sectPr/>

</xml_diff>

<commit_message>
Resume: restore clean styling with updated wording
</commit_message>
<xml_diff>
--- a/assets/AD_Annas_Resume.docx
+++ b/assets/AD_Annas_Resume.docx
@@ -37,19 +37,19 @@
         <w:t xml:space="preserve"> </w:t>
       </w:r>
       <w:r>
-        <w:t xml:space="preserve">Troutman, NC (Remote) • (704) 604-9093 • aarondanielannas@gmail.com</w:t>
-      </w:r>
-      <w:r>
-        <w:t xml:space="preserve"> </w:t>
-      </w:r>
-      <w:r>
-        <w:t xml:space="preserve">www.aarondanielannas.com • LinkedIn: linkedin.com/in/aaron-daniel-annas-6403a417</w:t>
-      </w:r>
-      <w:r>
-        <w:t xml:space="preserve"> </w:t>
-      </w:r>
-      <w:r>
-        <w:t xml:space="preserve">IMDb: imdb.com/name/nm4644428 • FilmFreeway: filmfreeway.com/AaronDanielAnnas</w:t>
+        <w:t xml:space="preserve">Troutman, NC (Remote) | (704) 604-9093 | aarondanielannas@gmail.com</w:t>
+      </w:r>
+      <w:r>
+        <w:t xml:space="preserve"> </w:t>
+      </w:r>
+      <w:r>
+        <w:t xml:space="preserve">LinkedIn: linkedin.com/in/aaron-daniel-annas-6403a417</w:t>
+      </w:r>
+      <w:r>
+        <w:t xml:space="preserve"> </w:t>
+      </w:r>
+      <w:r>
+        <w:t xml:space="preserve">IMDb: imdb.com/name/nm4644428 | FilmFreeway: filmfreeway.com/AaronDanielAnnas</w:t>
       </w:r>
     </w:p>
     <w:p>
@@ -57,7 +57,7 @@
         <w:pStyle w:val="BodyText"/>
       </w:pPr>
       <w:r>
-        <w:t xml:space="preserve">EXECUTIVE SUMMARY</w:t>
+        <w:t xml:space="preserve">Executive summary</w:t>
       </w:r>
       <w:r>
         <w:t xml:space="preserve"> </w:t>
@@ -71,55 +71,55 @@
         <w:pStyle w:val="BodyText"/>
       </w:pPr>
       <w:r>
-        <w:t xml:space="preserve">CORE STRENGTHS</w:t>
-      </w:r>
-      <w:r>
-        <w:t xml:space="preserve"> </w:t>
-      </w:r>
-      <w:r>
-        <w:t xml:space="preserve">• Creative Direction &amp; Storytelling</w:t>
-      </w:r>
-      <w:r>
-        <w:t xml:space="preserve"> </w:t>
-      </w:r>
-      <w:r>
-        <w:t xml:space="preserve">• Content Strategy &amp; Multi-Platform Media</w:t>
-      </w:r>
-      <w:r>
-        <w:t xml:space="preserve"> </w:t>
-      </w:r>
-      <w:r>
-        <w:t xml:space="preserve">• Video Production (Pre-Post Pipeline)</w:t>
-      </w:r>
-      <w:r>
-        <w:t xml:space="preserve"> </w:t>
-      </w:r>
-      <w:r>
-        <w:t xml:space="preserve">• Team Leadership &amp; Collaboration</w:t>
-      </w:r>
-      <w:r>
-        <w:t xml:space="preserve"> </w:t>
-      </w:r>
-      <w:r>
-        <w:t xml:space="preserve">• Narrative Development &amp; Audience Engagement</w:t>
-      </w:r>
-      <w:r>
-        <w:t xml:space="preserve"> </w:t>
-      </w:r>
-      <w:r>
-        <w:t xml:space="preserve">• Editorial Oversight &amp; Post-Production</w:t>
-      </w:r>
-      <w:r>
-        <w:t xml:space="preserve"> </w:t>
-      </w:r>
-      <w:r>
-        <w:t xml:space="preserve">• Media Workflows &amp; Systems</w:t>
-      </w:r>
-      <w:r>
-        <w:t xml:space="preserve"> </w:t>
-      </w:r>
-      <w:r>
-        <w:t xml:space="preserve">• AI in Media Production</w:t>
+        <w:t xml:space="preserve">Core strengths</w:t>
+      </w:r>
+      <w:r>
+        <w:t xml:space="preserve"> </w:t>
+      </w:r>
+      <w:r>
+        <w:t xml:space="preserve">- Creative Direction &amp; Storytelling</w:t>
+      </w:r>
+      <w:r>
+        <w:t xml:space="preserve"> </w:t>
+      </w:r>
+      <w:r>
+        <w:t xml:space="preserve">- Content Strategy &amp; Multi-Platform Media</w:t>
+      </w:r>
+      <w:r>
+        <w:t xml:space="preserve"> </w:t>
+      </w:r>
+      <w:r>
+        <w:t xml:space="preserve">- Video Production (Pre-Post Pipeline)</w:t>
+      </w:r>
+      <w:r>
+        <w:t xml:space="preserve"> </w:t>
+      </w:r>
+      <w:r>
+        <w:t xml:space="preserve">- Team Leadership &amp; Collaboration</w:t>
+      </w:r>
+      <w:r>
+        <w:t xml:space="preserve"> </w:t>
+      </w:r>
+      <w:r>
+        <w:t xml:space="preserve">- Narrative Development &amp; Audience Engagement</w:t>
+      </w:r>
+      <w:r>
+        <w:t xml:space="preserve"> </w:t>
+      </w:r>
+      <w:r>
+        <w:t xml:space="preserve">- Editorial Oversight &amp; Post-Production</w:t>
+      </w:r>
+      <w:r>
+        <w:t xml:space="preserve"> </w:t>
+      </w:r>
+      <w:r>
+        <w:t xml:space="preserve">- Media Workflows &amp; Systems</w:t>
+      </w:r>
+      <w:r>
+        <w:t xml:space="preserve"> </w:t>
+      </w:r>
+      <w:r>
+        <w:t xml:space="preserve">- AI in Media Production</w:t>
       </w:r>
     </w:p>
     <w:p>
@@ -127,7 +127,7 @@
         <w:pStyle w:val="BodyText"/>
       </w:pPr>
       <w:r>
-        <w:t xml:space="preserve">PROFESSIONAL EXPERIENCE</w:t>
+        <w:t xml:space="preserve">Professional experience</w:t>
       </w:r>
       <w:r>
         <w:t xml:space="preserve"> </w:t>
@@ -139,43 +139,43 @@
         <w:t xml:space="preserve"> </w:t>
       </w:r>
       <w:r>
-        <w:t xml:space="preserve">• Lead a multidisciplinary media program, overseeing creative direction, production workflows, and team development across video and digital content</w:t>
-      </w:r>
-      <w:r>
-        <w:t xml:space="preserve"> </w:t>
-      </w:r>
-      <w:r>
-        <w:t xml:space="preserve">• Direct and supervise documentary and narrative projects from concept through distribution</w:t>
-      </w:r>
-      <w:r>
-        <w:t xml:space="preserve"> </w:t>
-      </w:r>
-      <w:r>
-        <w:t xml:space="preserve">• Manage teams of collaborators across writing, production, and post-production</w:t>
-      </w:r>
-      <w:r>
-        <w:t xml:space="preserve"> </w:t>
-      </w:r>
-      <w:r>
-        <w:t xml:space="preserve">• Develop structured workflows for planning, production, editing, and delivery</w:t>
-      </w:r>
-      <w:r>
-        <w:t xml:space="preserve"> </w:t>
-      </w:r>
-      <w:r>
-        <w:t xml:space="preserve">• Manage budgets, equipment systems, and external creative partnerships</w:t>
-      </w:r>
-      <w:r>
-        <w:t xml:space="preserve"> </w:t>
-      </w:r>
-      <w:r>
-        <w:t xml:space="preserve">• Integrate emerging tools, including AI, into production processes</w:t>
-      </w:r>
-      <w:r>
-        <w:t xml:space="preserve"> </w:t>
-      </w:r>
-      <w:r>
-        <w:t xml:space="preserve">• Translate institutional priorities into story-driven content and messaging that supports recruitment, engagement, and program visibility</w:t>
+        <w:t xml:space="preserve">- Lead a multidisciplinary media program, overseeing creative direction, production workflows, and team development across video and digital content</w:t>
+      </w:r>
+      <w:r>
+        <w:t xml:space="preserve"> </w:t>
+      </w:r>
+      <w:r>
+        <w:t xml:space="preserve">- Direct and supervise documentary and narrative projects from concept through distribution</w:t>
+      </w:r>
+      <w:r>
+        <w:t xml:space="preserve"> </w:t>
+      </w:r>
+      <w:r>
+        <w:t xml:space="preserve">- Manage teams of collaborators across writing, production, and post-production</w:t>
+      </w:r>
+      <w:r>
+        <w:t xml:space="preserve"> </w:t>
+      </w:r>
+      <w:r>
+        <w:t xml:space="preserve">- Develop structured workflows for planning, production, editing, and delivery</w:t>
+      </w:r>
+      <w:r>
+        <w:t xml:space="preserve"> </w:t>
+      </w:r>
+      <w:r>
+        <w:t xml:space="preserve">- Manage budgets, equipment systems, and external creative partnerships</w:t>
+      </w:r>
+      <w:r>
+        <w:t xml:space="preserve"> </w:t>
+      </w:r>
+      <w:r>
+        <w:t xml:space="preserve">- Integrate emerging tools, including AI, into production processes</w:t>
+      </w:r>
+      <w:r>
+        <w:t xml:space="preserve"> </w:t>
+      </w:r>
+      <w:r>
+        <w:t xml:space="preserve">- Translate institutional priorities into story-driven content and messaging that supports recruitment, engagement, and program visibility</w:t>
       </w:r>
     </w:p>
     <w:p>
@@ -189,37 +189,37 @@
         <w:t xml:space="preserve"> </w:t>
       </w:r>
       <w:r>
-        <w:t xml:space="preserve">• Led program operations and creative production strategy across multiple media projects</w:t>
-      </w:r>
-      <w:r>
-        <w:t xml:space="preserve"> </w:t>
-      </w:r>
-      <w:r>
-        <w:t xml:space="preserve">• Supervised production teams and post-production pipelines</w:t>
-      </w:r>
-      <w:r>
-        <w:t xml:space="preserve"> </w:t>
-      </w:r>
-      <w:r>
-        <w:t xml:space="preserve">• Served as Academic Supervisor for the Buffalo/Niagara Film Office, supporting regional media production and partnerships</w:t>
-      </w:r>
-      <w:r>
-        <w:t xml:space="preserve"> </w:t>
-      </w:r>
-      <w:r>
-        <w:t xml:space="preserve">• Managed shared media infrastructure including Avid systems and collaborative workflows</w:t>
-      </w:r>
-      <w:r>
-        <w:t xml:space="preserve"> </w:t>
-      </w:r>
-      <w:r>
-        <w:t xml:space="preserve">• Directed SUNYWide Film Festival, overseeing programming and execution</w:t>
-      </w:r>
-      <w:r>
-        <w:t xml:space="preserve"> </w:t>
-      </w:r>
-      <w:r>
-        <w:t xml:space="preserve">• Led content and storytelling initiatives that supported program growth, audience engagement, and external partnerships</w:t>
+        <w:t xml:space="preserve">- Led program operations and creative production strategy across multiple media projects</w:t>
+      </w:r>
+      <w:r>
+        <w:t xml:space="preserve"> </w:t>
+      </w:r>
+      <w:r>
+        <w:t xml:space="preserve">- Supervised production teams and post-production pipelines</w:t>
+      </w:r>
+      <w:r>
+        <w:t xml:space="preserve"> </w:t>
+      </w:r>
+      <w:r>
+        <w:t xml:space="preserve">- Served as Academic Supervisor for the Buffalo/Niagara Film Office, supporting regional media production and partnerships</w:t>
+      </w:r>
+      <w:r>
+        <w:t xml:space="preserve"> </w:t>
+      </w:r>
+      <w:r>
+        <w:t xml:space="preserve">- Managed shared media infrastructure including Avid systems and collaborative workflows</w:t>
+      </w:r>
+      <w:r>
+        <w:t xml:space="preserve"> </w:t>
+      </w:r>
+      <w:r>
+        <w:t xml:space="preserve">- Directed SUNYWide Film Festival, overseeing programming and execution</w:t>
+      </w:r>
+      <w:r>
+        <w:t xml:space="preserve"> </w:t>
+      </w:r>
+      <w:r>
+        <w:t xml:space="preserve">- Led content and storytelling initiatives that supported program growth, audience engagement, and external partnerships</w:t>
       </w:r>
     </w:p>
     <w:p>
@@ -233,13 +233,13 @@
         <w:t xml:space="preserve"> </w:t>
       </w:r>
       <w:r>
-        <w:t xml:space="preserve">• Taught and supervised production-focused coursework in cinematography, editing, and storytelling</w:t>
-      </w:r>
-      <w:r>
-        <w:t xml:space="preserve"> </w:t>
-      </w:r>
-      <w:r>
-        <w:t xml:space="preserve">• Led international experiential learning programs focused on film production and industry engagement</w:t>
+        <w:t xml:space="preserve">- Taught and supervised production-focused coursework in cinematography, editing, and storytelling</w:t>
+      </w:r>
+      <w:r>
+        <w:t xml:space="preserve"> </w:t>
+      </w:r>
+      <w:r>
+        <w:t xml:space="preserve">- Led international experiential learning programs focused on film production and industry engagement</w:t>
       </w:r>
     </w:p>
     <w:p>
@@ -247,37 +247,37 @@
         <w:pStyle w:val="BodyText"/>
       </w:pPr>
       <w:r>
-        <w:t xml:space="preserve">Independent Work | Filmmaker, Editor &amp; Creative Lead | Ongoing</w:t>
-      </w:r>
-      <w:r>
-        <w:t xml:space="preserve"> </w:t>
-      </w:r>
-      <w:r>
-        <w:t xml:space="preserve">• Directed and edited independent documentary and narrative projects, including feature-length work</w:t>
-      </w:r>
-      <w:r>
-        <w:t xml:space="preserve"> </w:t>
-      </w:r>
-      <w:r>
-        <w:t xml:space="preserve">• Contributed to nationally and internationally distributed productions in roles including editor, associate producer, and post-production support across networks such as National Geographic and History Channel</w:t>
-      </w:r>
-      <w:r>
-        <w:t xml:space="preserve"> </w:t>
-      </w:r>
-      <w:r>
-        <w:t xml:space="preserve">• Managed production workflows including editing, visual effects, and finishing processes</w:t>
-      </w:r>
-      <w:r>
-        <w:t xml:space="preserve"> </w:t>
-      </w:r>
-      <w:r>
-        <w:t xml:space="preserve">• Developed human-centered storytelling approaches that translate complex topics into engaging narratives</w:t>
-      </w:r>
-      <w:r>
-        <w:t xml:space="preserve"> </w:t>
-      </w:r>
-      <w:r>
-        <w:t xml:space="preserve">• Developed and delivered content across platforms with attention to audience engagement, distribution strategy, and narrative clarity</w:t>
+        <w:t xml:space="preserve">Independent work | Filmmaker, Editor &amp; Creative Lead | Ongoing</w:t>
+      </w:r>
+      <w:r>
+        <w:t xml:space="preserve"> </w:t>
+      </w:r>
+      <w:r>
+        <w:t xml:space="preserve">- Directed and edited independent documentary and narrative projects, including feature-length work</w:t>
+      </w:r>
+      <w:r>
+        <w:t xml:space="preserve"> </w:t>
+      </w:r>
+      <w:r>
+        <w:t xml:space="preserve">- Contributed to nationally and internationally distributed productions in roles including editor, associate producer, and post-production support across networks such as National Geographic and History Channel</w:t>
+      </w:r>
+      <w:r>
+        <w:t xml:space="preserve"> </w:t>
+      </w:r>
+      <w:r>
+        <w:t xml:space="preserve">- Managed production workflows including editing, visual effects, and finishing processes</w:t>
+      </w:r>
+      <w:r>
+        <w:t xml:space="preserve"> </w:t>
+      </w:r>
+      <w:r>
+        <w:t xml:space="preserve">- Developed human-centered storytelling approaches that translate complex topics into engaging narratives</w:t>
+      </w:r>
+      <w:r>
+        <w:t xml:space="preserve"> </w:t>
+      </w:r>
+      <w:r>
+        <w:t xml:space="preserve">- Developed and delivered content across platforms with attention to audience engagement, distribution strategy, and narrative clarity</w:t>
       </w:r>
     </w:p>
     <w:p>
@@ -285,7 +285,7 @@
         <w:pStyle w:val="BodyText"/>
       </w:pPr>
       <w:r>
-        <w:t xml:space="preserve">SELECTED PROJECTS</w:t>
+        <w:t xml:space="preserve">Selected projects</w:t>
       </w:r>
       <w:r>
         <w:t xml:space="preserve"> </w:t>
@@ -297,13 +297,13 @@
         <w:t xml:space="preserve"> </w:t>
       </w:r>
       <w:r>
-        <w:t xml:space="preserve">• Documentary exploring economic inequality through personal storytelling</w:t>
-      </w:r>
-      <w:r>
-        <w:t xml:space="preserve"> </w:t>
-      </w:r>
-      <w:r>
-        <w:t xml:space="preserve">• Broadcast on PBS North Carolina and screened at festivals, engaging audiences around real-world economic challenges through human-centered storytelling</w:t>
+        <w:t xml:space="preserve">- Documentary exploring economic inequality through personal storytelling</w:t>
+      </w:r>
+      <w:r>
+        <w:t xml:space="preserve"> </w:t>
+      </w:r>
+      <w:r>
+        <w:t xml:space="preserve">- Broadcast on PBS North Carolina and screened at festivals, engaging audiences around real-world economic challenges through human-centered storytelling</w:t>
       </w:r>
     </w:p>
     <w:p>
@@ -317,19 +317,19 @@
         <w:t xml:space="preserve"> </w:t>
       </w:r>
       <w:r>
-        <w:t xml:space="preserve">• Feature documentary with international distribution across major streaming platforms including Apple TV, Amazon Prime Video, and Tubi, reaching broad digital audiences</w:t>
-      </w:r>
-      <w:r>
-        <w:t xml:space="preserve"> </w:t>
-      </w:r>
-      <w:r>
-        <w:t xml:space="preserve">• Award-winning project demonstrating strong narrative development and audience engagement</w:t>
-      </w:r>
-      <w:r>
-        <w:t xml:space="preserve"> </w:t>
-      </w:r>
-      <w:r>
-        <w:t xml:space="preserve">• Reaching broad digital audiences across major streaming platforms</w:t>
+        <w:t xml:space="preserve">- Feature documentary with international distribution across major streaming platforms including Apple TV, Amazon Prime Video, and Tubi</w:t>
+      </w:r>
+      <w:r>
+        <w:t xml:space="preserve"> </w:t>
+      </w:r>
+      <w:r>
+        <w:t xml:space="preserve">- Award-winning project demonstrating strong narrative development and audience engagement</w:t>
+      </w:r>
+      <w:r>
+        <w:t xml:space="preserve"> </w:t>
+      </w:r>
+      <w:r>
+        <w:t xml:space="preserve">- Reaching broad digital audiences across major streaming platforms</w:t>
       </w:r>
     </w:p>
     <w:p>
@@ -343,7 +343,7 @@
         <w:t xml:space="preserve"> </w:t>
       </w:r>
       <w:r>
-        <w:t xml:space="preserve">• Feature documentary distributed internationally via broadcast and streaming</w:t>
+        <w:t xml:space="preserve">- Feature documentary distributed internationally via broadcast and streaming</w:t>
       </w:r>
     </w:p>
     <w:p>
@@ -357,7 +357,7 @@
         <w:t xml:space="preserve"> </w:t>
       </w:r>
       <w:r>
-        <w:t xml:space="preserve">• Broadcast documentary for National Geographic Channel</w:t>
+        <w:t xml:space="preserve">- Broadcast documentary for National Geographic Channel</w:t>
       </w:r>
     </w:p>
     <w:p>
@@ -365,7 +365,7 @@
         <w:pStyle w:val="BodyText"/>
       </w:pPr>
       <w:r>
-        <w:t xml:space="preserve">EDUCATION</w:t>
+        <w:t xml:space="preserve">Education</w:t>
       </w:r>
       <w:r>
         <w:t xml:space="preserve"> </w:t>
@@ -385,19 +385,19 @@
         <w:pStyle w:val="BodyText"/>
       </w:pPr>
       <w:r>
-        <w:t xml:space="preserve">TECHNICAL SKILLS</w:t>
-      </w:r>
-      <w:r>
-        <w:t xml:space="preserve"> </w:t>
-      </w:r>
-      <w:r>
-        <w:t xml:space="preserve">Avid Media Composer (Certified) • Adobe Creative Suite (Premiere Pro, After Effects, Photoshop) • Pro Tools</w:t>
-      </w:r>
-      <w:r>
-        <w:t xml:space="preserve"> </w:t>
-      </w:r>
-      <w:r>
-        <w:t xml:space="preserve">Avid NEXUS / Interplay systems • Media workflows, post-production pipelines, and compression</w:t>
+        <w:t xml:space="preserve">Technical skills</w:t>
+      </w:r>
+      <w:r>
+        <w:t xml:space="preserve"> </w:t>
+      </w:r>
+      <w:r>
+        <w:t xml:space="preserve">Avid Media Composer (Certified) | Adobe Creative Suite (Premiere Pro, After Effects, Photoshop) | Pro Tools</w:t>
+      </w:r>
+      <w:r>
+        <w:t xml:space="preserve"> </w:t>
+      </w:r>
+      <w:r>
+        <w:t xml:space="preserve">Avid NEXUS / Interplay systems | Media workflows, post-production pipelines, and compression</w:t>
       </w:r>
     </w:p>
     <w:sectPr/>

</xml_diff>

<commit_message>
Resume formatting repair (2-page scanable)
</commit_message>
<xml_diff>
--- a/assets/AD_Annas_Resume.docx
+++ b/assets/AD_Annas_Resume.docx
@@ -37,7 +37,13 @@
         <w:t xml:space="preserve"> </w:t>
       </w:r>
       <w:r>
-        <w:t xml:space="preserve">Troutman, NC (Remote) | (704) 604-9093 | aarondanielannas@gmail.com</w:t>
+        <w:t xml:space="preserve">Troutman, NC (Remote)</w:t>
+      </w:r>
+      <w:r>
+        <w:t xml:space="preserve"> </w:t>
+      </w:r>
+      <w:r>
+        <w:t xml:space="preserve">(704) 604-9093 | aarondanielannas@gmail.com | www.aarondanielannas.com</w:t>
       </w:r>
       <w:r>
         <w:t xml:space="preserve"> </w:t>
@@ -52,18 +58,251 @@
         <w:t xml:space="preserve">IMDb: imdb.com/name/nm4644428 | FilmFreeway: filmfreeway.com/AaronDanielAnnas</w:t>
       </w:r>
     </w:p>
+    <w:bookmarkStart w:id="20" w:name="executive-summary"/>
+    <w:p>
+      <w:pPr>
+        <w:pStyle w:val="Heading2"/>
+      </w:pPr>
+      <w:r>
+        <w:t xml:space="preserve">Executive Summary</w:t>
+      </w:r>
+    </w:p>
+    <w:p>
+      <w:pPr>
+        <w:pStyle w:val="FirstParagraph"/>
+      </w:pPr>
+      <w:r>
+        <w:t xml:space="preserve">Creative leader and award-winning filmmaker with 10+ years of experience developing and executing story-driven content across documentary, broadcast, and digital platforms. Proven ability to lead teams, shape narrative strategy, and deliver compelling content that engages audiences and supports mission-driven goals. Experienced across directing, editing, and post-production leadership, with a strong understanding of how content strategy, storytelling, and distribution align to reach and engage audiences.</w:t>
+      </w:r>
+    </w:p>
+    <w:bookmarkEnd w:id="20"/>
+    <w:bookmarkStart w:id="21" w:name="core-strengths"/>
+    <w:p>
+      <w:pPr>
+        <w:pStyle w:val="Heading2"/>
+      </w:pPr>
+      <w:r>
+        <w:t xml:space="preserve">Core Strengths</w:t>
+      </w:r>
+    </w:p>
+    <w:p>
+      <w:pPr>
+        <w:numPr>
+          <w:ilvl w:val="0"/>
+          <w:numId w:val="1001"/>
+        </w:numPr>
+        <w:pStyle w:val="Compact"/>
+      </w:pPr>
+      <w:r>
+        <w:t xml:space="preserve">Creative Direction &amp; Storytelling</w:t>
+      </w:r>
+    </w:p>
+    <w:p>
+      <w:pPr>
+        <w:numPr>
+          <w:ilvl w:val="0"/>
+          <w:numId w:val="1001"/>
+        </w:numPr>
+        <w:pStyle w:val="Compact"/>
+      </w:pPr>
+      <w:r>
+        <w:t xml:space="preserve">Content Strategy &amp; Multi-Platform Media</w:t>
+      </w:r>
+    </w:p>
+    <w:p>
+      <w:pPr>
+        <w:numPr>
+          <w:ilvl w:val="0"/>
+          <w:numId w:val="1001"/>
+        </w:numPr>
+        <w:pStyle w:val="Compact"/>
+      </w:pPr>
+      <w:r>
+        <w:t xml:space="preserve">Video Production (Pre-Post Pipeline)</w:t>
+      </w:r>
+    </w:p>
+    <w:p>
+      <w:pPr>
+        <w:numPr>
+          <w:ilvl w:val="0"/>
+          <w:numId w:val="1001"/>
+        </w:numPr>
+        <w:pStyle w:val="Compact"/>
+      </w:pPr>
+      <w:r>
+        <w:t xml:space="preserve">Team Leadership &amp; Collaboration</w:t>
+      </w:r>
+    </w:p>
+    <w:p>
+      <w:pPr>
+        <w:numPr>
+          <w:ilvl w:val="0"/>
+          <w:numId w:val="1001"/>
+        </w:numPr>
+        <w:pStyle w:val="Compact"/>
+      </w:pPr>
+      <w:r>
+        <w:t xml:space="preserve">Narrative Development &amp; Audience Engagement</w:t>
+      </w:r>
+    </w:p>
+    <w:p>
+      <w:pPr>
+        <w:numPr>
+          <w:ilvl w:val="0"/>
+          <w:numId w:val="1001"/>
+        </w:numPr>
+        <w:pStyle w:val="Compact"/>
+      </w:pPr>
+      <w:r>
+        <w:t xml:space="preserve">Editorial Oversight &amp; Post-Production</w:t>
+      </w:r>
+    </w:p>
+    <w:p>
+      <w:pPr>
+        <w:numPr>
+          <w:ilvl w:val="0"/>
+          <w:numId w:val="1001"/>
+        </w:numPr>
+        <w:pStyle w:val="Compact"/>
+      </w:pPr>
+      <w:r>
+        <w:t xml:space="preserve">Media Workflows &amp; Systems</w:t>
+      </w:r>
+    </w:p>
+    <w:p>
+      <w:pPr>
+        <w:numPr>
+          <w:ilvl w:val="0"/>
+          <w:numId w:val="1001"/>
+        </w:numPr>
+        <w:pStyle w:val="Compact"/>
+      </w:pPr>
+      <w:r>
+        <w:t xml:space="preserve">AI in Media Production</w:t>
+      </w:r>
+    </w:p>
+    <w:bookmarkEnd w:id="21"/>
+    <w:bookmarkStart w:id="22" w:name="professional-experience"/>
+    <w:p>
+      <w:pPr>
+        <w:pStyle w:val="Heading2"/>
+      </w:pPr>
+      <w:r>
+        <w:t xml:space="preserve">Professional Experience</w:t>
+      </w:r>
+    </w:p>
+    <w:p>
+      <w:pPr>
+        <w:pStyle w:val="FirstParagraph"/>
+      </w:pPr>
+      <w:r>
+        <w:rPr>
+          <w:bCs/>
+          <w:b/>
+        </w:rPr>
+        <w:t xml:space="preserve">Catawba College</w:t>
+      </w:r>
+      <w:r>
+        <w:t xml:space="preserve"> </w:t>
+      </w:r>
+      <w:r>
+        <w:t xml:space="preserve">| Chair &amp; Associate Professor, Communication Arts and Media | 2024–Present</w:t>
+      </w:r>
+      <w:r>
+        <w:t xml:space="preserve"> </w:t>
+      </w:r>
+      <w:r>
+        <w:t xml:space="preserve">- Lead a multidisciplinary media program, overseeing creative direction, production workflows, and team development across video and digital content</w:t>
+      </w:r>
+      <w:r>
+        <w:t xml:space="preserve"> </w:t>
+      </w:r>
+      <w:r>
+        <w:t xml:space="preserve">- Direct and supervise documentary and narrative projects from concept through distribution</w:t>
+      </w:r>
+      <w:r>
+        <w:t xml:space="preserve"> </w:t>
+      </w:r>
+      <w:r>
+        <w:t xml:space="preserve">- Manage teams of collaborators across writing, production, and post-production</w:t>
+      </w:r>
+      <w:r>
+        <w:t xml:space="preserve"> </w:t>
+      </w:r>
+      <w:r>
+        <w:t xml:space="preserve">- Develop structured workflows for planning, production, editing, and delivery</w:t>
+      </w:r>
+      <w:r>
+        <w:t xml:space="preserve"> </w:t>
+      </w:r>
+      <w:r>
+        <w:t xml:space="preserve">- Manage budgets, equipment systems, and external creative partnerships</w:t>
+      </w:r>
+      <w:r>
+        <w:t xml:space="preserve"> </w:t>
+      </w:r>
+      <w:r>
+        <w:t xml:space="preserve">- Integrate emerging tools, including AI, into production processes</w:t>
+      </w:r>
+      <w:r>
+        <w:t xml:space="preserve"> </w:t>
+      </w:r>
+      <w:r>
+        <w:t xml:space="preserve">- Translate institutional priorities into story-driven content and messaging that supports recruitment, engagement, and program visibility</w:t>
+      </w:r>
+    </w:p>
     <w:p>
       <w:pPr>
         <w:pStyle w:val="BodyText"/>
       </w:pPr>
       <w:r>
-        <w:t xml:space="preserve">Executive summary</w:t>
-      </w:r>
-      <w:r>
-        <w:t xml:space="preserve"> </w:t>
-      </w:r>
-      <w:r>
-        <w:t xml:space="preserve">Creative leader and award-winning filmmaker with 10+ years of experience developing and executing story-driven content across documentary, broadcast, and digital platforms. Proven ability to lead teams, shape narrative strategy, and deliver compelling content that engages audiences and supports mission-driven goals. Experienced across directing, editing, and post-production leadership, with a strong understanding of how content strategy, storytelling, and distribution align to reach and engage audiences.</w:t>
+        <w:rPr>
+          <w:bCs/>
+          <w:b/>
+        </w:rPr>
+        <w:t xml:space="preserve">SUNY Buffalo State University</w:t>
+      </w:r>
+      <w:r>
+        <w:t xml:space="preserve"> </w:t>
+      </w:r>
+      <w:r>
+        <w:t xml:space="preserve">| Director, Television &amp; Film Arts Program / Associate Professor | 2018–2024</w:t>
+      </w:r>
+      <w:r>
+        <w:t xml:space="preserve"> </w:t>
+      </w:r>
+      <w:r>
+        <w:t xml:space="preserve">- Led program operations and creative production strategy across multiple media projects</w:t>
+      </w:r>
+      <w:r>
+        <w:t xml:space="preserve"> </w:t>
+      </w:r>
+      <w:r>
+        <w:t xml:space="preserve">- Supervised production teams and post-production pipelines</w:t>
+      </w:r>
+      <w:r>
+        <w:t xml:space="preserve"> </w:t>
+      </w:r>
+      <w:r>
+        <w:t xml:space="preserve">- Served as Academic Supervisor for the Buffalo/Niagara Film Office, supporting regional media production and partnerships</w:t>
+      </w:r>
+      <w:r>
+        <w:t xml:space="preserve"> </w:t>
+      </w:r>
+      <w:r>
+        <w:t xml:space="preserve">- Managed shared media infrastructure including Avid systems and collaborative workflows</w:t>
+      </w:r>
+      <w:r>
+        <w:t xml:space="preserve"> </w:t>
+      </w:r>
+      <w:r>
+        <w:t xml:space="preserve">- Directed SUNYWide Film Festival, overseeing programming and execution</w:t>
+      </w:r>
+      <w:r>
+        <w:t xml:space="preserve"> </w:t>
+      </w:r>
+      <w:r>
+        <w:t xml:space="preserve">- Led content and storytelling initiatives that supported program growth, audience engagement, and external partnerships</w:t>
       </w:r>
     </w:p>
     <w:p>
@@ -71,55 +310,29 @@
         <w:pStyle w:val="BodyText"/>
       </w:pPr>
       <w:r>
-        <w:t xml:space="preserve">Core strengths</w:t>
-      </w:r>
-      <w:r>
-        <w:t xml:space="preserve"> </w:t>
-      </w:r>
-      <w:r>
-        <w:t xml:space="preserve">- Creative Direction &amp; Storytelling</w:t>
-      </w:r>
-      <w:r>
-        <w:t xml:space="preserve"> </w:t>
-      </w:r>
-      <w:r>
-        <w:t xml:space="preserve">- Content Strategy &amp; Multi-Platform Media</w:t>
-      </w:r>
-      <w:r>
-        <w:t xml:space="preserve"> </w:t>
-      </w:r>
-      <w:r>
-        <w:t xml:space="preserve">- Video Production (Pre-Post Pipeline)</w:t>
-      </w:r>
-      <w:r>
-        <w:t xml:space="preserve"> </w:t>
-      </w:r>
-      <w:r>
-        <w:t xml:space="preserve">- Team Leadership &amp; Collaboration</w:t>
-      </w:r>
-      <w:r>
-        <w:t xml:space="preserve"> </w:t>
-      </w:r>
-      <w:r>
-        <w:t xml:space="preserve">- Narrative Development &amp; Audience Engagement</w:t>
-      </w:r>
-      <w:r>
-        <w:t xml:space="preserve"> </w:t>
-      </w:r>
-      <w:r>
-        <w:t xml:space="preserve">- Editorial Oversight &amp; Post-Production</w:t>
-      </w:r>
-      <w:r>
-        <w:t xml:space="preserve"> </w:t>
-      </w:r>
-      <w:r>
-        <w:t xml:space="preserve">- Media Workflows &amp; Systems</w:t>
-      </w:r>
-      <w:r>
-        <w:t xml:space="preserve"> </w:t>
-      </w:r>
-      <w:r>
-        <w:t xml:space="preserve">- AI in Media Production</w:t>
+        <w:rPr>
+          <w:bCs/>
+          <w:b/>
+        </w:rPr>
+        <w:t xml:space="preserve">Vanguard University</w:t>
+      </w:r>
+      <w:r>
+        <w:t xml:space="preserve"> </w:t>
+      </w:r>
+      <w:r>
+        <w:t xml:space="preserve">| Assistant Professor, Cinema Arts | 2012–2015</w:t>
+      </w:r>
+      <w:r>
+        <w:t xml:space="preserve"> </w:t>
+      </w:r>
+      <w:r>
+        <w:t xml:space="preserve">- Taught and supervised production-focused coursework in cinematography, editing, and storytelling</w:t>
+      </w:r>
+      <w:r>
+        <w:t xml:space="preserve"> </w:t>
+      </w:r>
+      <w:r>
+        <w:t xml:space="preserve">- Led international experiential learning programs focused on film production and industry engagement</w:t>
       </w:r>
     </w:p>
     <w:p>
@@ -127,55 +340,87 @@
         <w:pStyle w:val="BodyText"/>
       </w:pPr>
       <w:r>
-        <w:t xml:space="preserve">Professional experience</w:t>
-      </w:r>
-      <w:r>
-        <w:t xml:space="preserve"> </w:t>
-      </w:r>
-      <w:r>
-        <w:t xml:space="preserve">Catawba College | Chair &amp; Associate Professor, Communication Arts and Media | 2024–Present</w:t>
-      </w:r>
-      <w:r>
-        <w:t xml:space="preserve"> </w:t>
-      </w:r>
-      <w:r>
-        <w:t xml:space="preserve">- Lead a multidisciplinary media program, overseeing creative direction, production workflows, and team development across video and digital content</w:t>
-      </w:r>
-      <w:r>
-        <w:t xml:space="preserve"> </w:t>
-      </w:r>
-      <w:r>
-        <w:t xml:space="preserve">- Direct and supervise documentary and narrative projects from concept through distribution</w:t>
-      </w:r>
-      <w:r>
-        <w:t xml:space="preserve"> </w:t>
-      </w:r>
-      <w:r>
-        <w:t xml:space="preserve">- Manage teams of collaborators across writing, production, and post-production</w:t>
-      </w:r>
-      <w:r>
-        <w:t xml:space="preserve"> </w:t>
-      </w:r>
-      <w:r>
-        <w:t xml:space="preserve">- Develop structured workflows for planning, production, editing, and delivery</w:t>
-      </w:r>
-      <w:r>
-        <w:t xml:space="preserve"> </w:t>
-      </w:r>
-      <w:r>
-        <w:t xml:space="preserve">- Manage budgets, equipment systems, and external creative partnerships</w:t>
-      </w:r>
-      <w:r>
-        <w:t xml:space="preserve"> </w:t>
-      </w:r>
-      <w:r>
-        <w:t xml:space="preserve">- Integrate emerging tools, including AI, into production processes</w:t>
-      </w:r>
-      <w:r>
-        <w:t xml:space="preserve"> </w:t>
-      </w:r>
-      <w:r>
-        <w:t xml:space="preserve">- Translate institutional priorities into story-driven content and messaging that supports recruitment, engagement, and program visibility</w:t>
+        <w:rPr>
+          <w:bCs/>
+          <w:b/>
+        </w:rPr>
+        <w:t xml:space="preserve">Independent Work</w:t>
+      </w:r>
+      <w:r>
+        <w:t xml:space="preserve"> </w:t>
+      </w:r>
+      <w:r>
+        <w:t xml:space="preserve">| Filmmaker, Editor &amp; Creative Lead | Ongoing</w:t>
+      </w:r>
+      <w:r>
+        <w:t xml:space="preserve"> </w:t>
+      </w:r>
+      <w:r>
+        <w:t xml:space="preserve">- Directed and edited independent documentary and narrative projects, including feature-length work</w:t>
+      </w:r>
+      <w:r>
+        <w:t xml:space="preserve"> </w:t>
+      </w:r>
+      <w:r>
+        <w:t xml:space="preserve">- Contributed to nationally and internationally distributed productions in roles including editor, associate producer, and post-production support across networks such as National Geographic and History Channel</w:t>
+      </w:r>
+      <w:r>
+        <w:t xml:space="preserve"> </w:t>
+      </w:r>
+      <w:r>
+        <w:t xml:space="preserve">- Managed production workflows including editing, visual effects, and finishing processes</w:t>
+      </w:r>
+      <w:r>
+        <w:t xml:space="preserve"> </w:t>
+      </w:r>
+      <w:r>
+        <w:t xml:space="preserve">- Developed human-centered storytelling approaches that translate complex topics into engaging narratives</w:t>
+      </w:r>
+      <w:r>
+        <w:t xml:space="preserve"> </w:t>
+      </w:r>
+      <w:r>
+        <w:t xml:space="preserve">- Developed and delivered content across platforms with attention to audience engagement, distribution strategy, and narrative clarity</w:t>
+      </w:r>
+    </w:p>
+    <w:bookmarkEnd w:id="22"/>
+    <w:bookmarkStart w:id="23" w:name="selected-projects"/>
+    <w:p>
+      <w:pPr>
+        <w:pStyle w:val="Heading2"/>
+      </w:pPr>
+      <w:r>
+        <w:t xml:space="preserve">Selected Projects</w:t>
+      </w:r>
+    </w:p>
+    <w:p>
+      <w:pPr>
+        <w:pStyle w:val="FirstParagraph"/>
+      </w:pPr>
+      <w:r>
+        <w:rPr>
+          <w:bCs/>
+          <w:b/>
+        </w:rPr>
+        <w:t xml:space="preserve">Life in the Gap</w:t>
+      </w:r>
+      <w:r>
+        <w:t xml:space="preserve"> </w:t>
+      </w:r>
+      <w:r>
+        <w:t xml:space="preserve">| Director</w:t>
+      </w:r>
+      <w:r>
+        <w:t xml:space="preserve"> </w:t>
+      </w:r>
+      <w:r>
+        <w:t xml:space="preserve">- Documentary exploring economic inequality through personal storytelling</w:t>
+      </w:r>
+      <w:r>
+        <w:t xml:space="preserve"> </w:t>
+      </w:r>
+      <w:r>
+        <w:t xml:space="preserve">- Broadcast on PBS North Carolina and screened at festivals, engaging audiences around real-world economic challenges through human-centered storytelling</w:t>
       </w:r>
     </w:p>
     <w:p>
@@ -183,43 +428,29 @@
         <w:pStyle w:val="BodyText"/>
       </w:pPr>
       <w:r>
-        <w:t xml:space="preserve">SUNY Buffalo State University | Director, Television &amp; Film Arts Program / Associate Professor | 2018–2024</w:t>
-      </w:r>
-      <w:r>
-        <w:t xml:space="preserve"> </w:t>
-      </w:r>
-      <w:r>
-        <w:t xml:space="preserve">- Led program operations and creative production strategy across multiple media projects</w:t>
-      </w:r>
-      <w:r>
-        <w:t xml:space="preserve"> </w:t>
-      </w:r>
-      <w:r>
-        <w:t xml:space="preserve">- Supervised production teams and post-production pipelines</w:t>
-      </w:r>
-      <w:r>
-        <w:t xml:space="preserve"> </w:t>
-      </w:r>
-      <w:r>
-        <w:t xml:space="preserve">- Served as Academic Supervisor for the Buffalo/Niagara Film Office, supporting regional media production and partnerships</w:t>
-      </w:r>
-      <w:r>
-        <w:t xml:space="preserve"> </w:t>
-      </w:r>
-      <w:r>
-        <w:t xml:space="preserve">- Managed shared media infrastructure including Avid systems and collaborative workflows</w:t>
-      </w:r>
-      <w:r>
-        <w:t xml:space="preserve"> </w:t>
-      </w:r>
-      <w:r>
-        <w:t xml:space="preserve">- Directed SUNYWide Film Festival, overseeing programming and execution</w:t>
-      </w:r>
-      <w:r>
-        <w:t xml:space="preserve"> </w:t>
-      </w:r>
-      <w:r>
-        <w:t xml:space="preserve">- Led content and storytelling initiatives that supported program growth, audience engagement, and external partnerships</w:t>
+        <w:rPr>
+          <w:bCs/>
+          <w:b/>
+        </w:rPr>
+        <w:t xml:space="preserve">There’s No Such Thing as Ghosts?</w:t>
+      </w:r>
+      <w:r>
+        <w:t xml:space="preserve"> </w:t>
+      </w:r>
+      <w:r>
+        <w:t xml:space="preserve">| Director &amp; Editor</w:t>
+      </w:r>
+      <w:r>
+        <w:t xml:space="preserve"> </w:t>
+      </w:r>
+      <w:r>
+        <w:t xml:space="preserve">- Feature documentary with international distribution across major streaming platforms including Apple TV, Amazon Prime Video, and Tubi, reaching broad digital audiences</w:t>
+      </w:r>
+      <w:r>
+        <w:t xml:space="preserve"> </w:t>
+      </w:r>
+      <w:r>
+        <w:t xml:space="preserve">- Award-winning project demonstrating strong narrative development and audience engagement</w:t>
       </w:r>
     </w:p>
     <w:p>
@@ -227,19 +458,23 @@
         <w:pStyle w:val="BodyText"/>
       </w:pPr>
       <w:r>
-        <w:t xml:space="preserve">Vanguard University | Assistant Professor, Cinema Arts | 2012–2015</w:t>
-      </w:r>
-      <w:r>
-        <w:t xml:space="preserve"> </w:t>
-      </w:r>
-      <w:r>
-        <w:t xml:space="preserve">- Taught and supervised production-focused coursework in cinematography, editing, and storytelling</w:t>
-      </w:r>
-      <w:r>
-        <w:t xml:space="preserve"> </w:t>
-      </w:r>
-      <w:r>
-        <w:t xml:space="preserve">- Led international experiential learning programs focused on film production and industry engagement</w:t>
+        <w:rPr>
+          <w:bCs/>
+          <w:b/>
+        </w:rPr>
+        <w:t xml:space="preserve">There is Many Like Us</w:t>
+      </w:r>
+      <w:r>
+        <w:t xml:space="preserve"> </w:t>
+      </w:r>
+      <w:r>
+        <w:t xml:space="preserve">| Associate Producer &amp; Editor</w:t>
+      </w:r>
+      <w:r>
+        <w:t xml:space="preserve"> </w:t>
+      </w:r>
+      <w:r>
+        <w:t xml:space="preserve">- Feature documentary distributed internationally via broadcast and streaming</w:t>
       </w:r>
     </w:p>
     <w:p>
@@ -247,37 +482,41 @@
         <w:pStyle w:val="BodyText"/>
       </w:pPr>
       <w:r>
-        <w:t xml:space="preserve">Independent work | Filmmaker, Editor &amp; Creative Lead | Ongoing</w:t>
-      </w:r>
-      <w:r>
-        <w:t xml:space="preserve"> </w:t>
-      </w:r>
-      <w:r>
-        <w:t xml:space="preserve">- Directed and edited independent documentary and narrative projects, including feature-length work</w:t>
-      </w:r>
-      <w:r>
-        <w:t xml:space="preserve"> </w:t>
-      </w:r>
-      <w:r>
-        <w:t xml:space="preserve">- Contributed to nationally and internationally distributed productions in roles including editor, associate producer, and post-production support across networks such as National Geographic and History Channel</w:t>
-      </w:r>
-      <w:r>
-        <w:t xml:space="preserve"> </w:t>
-      </w:r>
-      <w:r>
-        <w:t xml:space="preserve">- Managed production workflows including editing, visual effects, and finishing processes</w:t>
-      </w:r>
-      <w:r>
-        <w:t xml:space="preserve"> </w:t>
-      </w:r>
-      <w:r>
-        <w:t xml:space="preserve">- Developed human-centered storytelling approaches that translate complex topics into engaging narratives</w:t>
-      </w:r>
-      <w:r>
-        <w:t xml:space="preserve"> </w:t>
-      </w:r>
-      <w:r>
-        <w:t xml:space="preserve">- Developed and delivered content across platforms with attention to audience engagement, distribution strategy, and narrative clarity</w:t>
+        <w:rPr>
+          <w:bCs/>
+          <w:b/>
+        </w:rPr>
+        <w:t xml:space="preserve">Inside World War II</w:t>
+      </w:r>
+      <w:r>
+        <w:t xml:space="preserve"> </w:t>
+      </w:r>
+      <w:r>
+        <w:t xml:space="preserve">| Associate Editor / SFX Design</w:t>
+      </w:r>
+      <w:r>
+        <w:t xml:space="preserve"> </w:t>
+      </w:r>
+      <w:r>
+        <w:t xml:space="preserve">- Broadcast documentary for National Geographic Channel</w:t>
+      </w:r>
+    </w:p>
+    <w:bookmarkEnd w:id="23"/>
+    <w:bookmarkStart w:id="24" w:name="education"/>
+    <w:p>
+      <w:pPr>
+        <w:pStyle w:val="Heading2"/>
+      </w:pPr>
+      <w:r>
+        <w:t xml:space="preserve">Education</w:t>
+      </w:r>
+    </w:p>
+    <w:p>
+      <w:pPr>
+        <w:pStyle w:val="FirstParagraph"/>
+      </w:pPr>
+      <w:r>
+        <w:t xml:space="preserve">MFA, Independent Film and Digital Imaging, Governors State University</w:t>
       </w:r>
     </w:p>
     <w:p>
@@ -285,121 +524,80 @@
         <w:pStyle w:val="BodyText"/>
       </w:pPr>
       <w:r>
-        <w:t xml:space="preserve">Selected projects</w:t>
-      </w:r>
-      <w:r>
-        <w:t xml:space="preserve"> </w:t>
-      </w:r>
-      <w:r>
-        <w:t xml:space="preserve">Life in the Gap | Director</w:t>
-      </w:r>
-      <w:r>
-        <w:t xml:space="preserve"> </w:t>
-      </w:r>
-      <w:r>
-        <w:t xml:space="preserve">- Documentary exploring economic inequality through personal storytelling</w:t>
-      </w:r>
-      <w:r>
-        <w:t xml:space="preserve"> </w:t>
-      </w:r>
-      <w:r>
-        <w:t xml:space="preserve">- Broadcast on PBS North Carolina and screened at festivals, engaging audiences around real-world economic challenges through human-centered storytelling</w:t>
-      </w:r>
-    </w:p>
-    <w:p>
-      <w:pPr>
-        <w:pStyle w:val="BodyText"/>
-      </w:pPr>
-      <w:r>
-        <w:t xml:space="preserve">There’s No Such Thing as Ghosts? | Director &amp; Editor</w:t>
-      </w:r>
-      <w:r>
-        <w:t xml:space="preserve"> </w:t>
-      </w:r>
-      <w:r>
-        <w:t xml:space="preserve">- Feature documentary with international distribution across major streaming platforms including Apple TV, Amazon Prime Video, and Tubi</w:t>
-      </w:r>
-      <w:r>
-        <w:t xml:space="preserve"> </w:t>
-      </w:r>
-      <w:r>
-        <w:t xml:space="preserve">- Award-winning project demonstrating strong narrative development and audience engagement</w:t>
-      </w:r>
-      <w:r>
-        <w:t xml:space="preserve"> </w:t>
-      </w:r>
-      <w:r>
-        <w:t xml:space="preserve">- Reaching broad digital audiences across major streaming platforms</w:t>
-      </w:r>
-    </w:p>
-    <w:p>
-      <w:pPr>
-        <w:pStyle w:val="BodyText"/>
-      </w:pPr>
-      <w:r>
-        <w:t xml:space="preserve">There is Many Like Us | Associate Producer &amp; Editor</w:t>
-      </w:r>
-      <w:r>
-        <w:t xml:space="preserve"> </w:t>
-      </w:r>
-      <w:r>
-        <w:t xml:space="preserve">- Feature documentary distributed internationally via broadcast and streaming</w:t>
-      </w:r>
-    </w:p>
-    <w:p>
-      <w:pPr>
-        <w:pStyle w:val="BodyText"/>
-      </w:pPr>
-      <w:r>
-        <w:t xml:space="preserve">Inside World War II | Associate Editor / SFX Design</w:t>
-      </w:r>
-      <w:r>
-        <w:t xml:space="preserve"> </w:t>
-      </w:r>
-      <w:r>
-        <w:t xml:space="preserve">- Broadcast documentary for National Geographic Channel</w:t>
-      </w:r>
-    </w:p>
-    <w:p>
-      <w:pPr>
-        <w:pStyle w:val="BodyText"/>
-      </w:pPr>
-      <w:r>
-        <w:t xml:space="preserve">Education</w:t>
-      </w:r>
-      <w:r>
-        <w:t xml:space="preserve"> </w:t>
-      </w:r>
-      <w:r>
-        <w:t xml:space="preserve">MFA, Independent Film and Digital Imaging, Governors State University</w:t>
-      </w:r>
-      <w:r>
-        <w:t xml:space="preserve"> </w:t>
-      </w:r>
-      <w:r>
         <w:t xml:space="preserve">BFA, Musical Theatre, Mars Hill University</w:t>
       </w:r>
     </w:p>
-    <w:p>
-      <w:pPr>
-        <w:pStyle w:val="BodyText"/>
-      </w:pPr>
-      <w:r>
-        <w:t xml:space="preserve">Technical skills</w:t>
-      </w:r>
-      <w:r>
-        <w:t xml:space="preserve"> </w:t>
-      </w:r>
-      <w:r>
-        <w:t xml:space="preserve">Avid Media Composer (Certified) | Adobe Creative Suite (Premiere Pro, After Effects, Photoshop) | Pro Tools</w:t>
-      </w:r>
-      <w:r>
-        <w:t xml:space="preserve"> </w:t>
-      </w:r>
-      <w:r>
-        <w:t xml:space="preserve">Avid NEXUS / Interplay systems | Media workflows, post-production pipelines, and compression</w:t>
-      </w:r>
-    </w:p>
+    <w:bookmarkEnd w:id="24"/>
+    <w:bookmarkStart w:id="25" w:name="technical-skills"/>
+    <w:p>
+      <w:pPr>
+        <w:pStyle w:val="Heading2"/>
+      </w:pPr>
+      <w:r>
+        <w:t xml:space="preserve">Technical Skills</w:t>
+      </w:r>
+    </w:p>
+    <w:p>
+      <w:pPr>
+        <w:numPr>
+          <w:ilvl w:val="0"/>
+          <w:numId w:val="1002"/>
+        </w:numPr>
+        <w:pStyle w:val="Compact"/>
+      </w:pPr>
+      <w:r>
+        <w:t xml:space="preserve">Avid Media Composer (Certified)</w:t>
+      </w:r>
+    </w:p>
+    <w:p>
+      <w:pPr>
+        <w:numPr>
+          <w:ilvl w:val="0"/>
+          <w:numId w:val="1002"/>
+        </w:numPr>
+        <w:pStyle w:val="Compact"/>
+      </w:pPr>
+      <w:r>
+        <w:t xml:space="preserve">Adobe Creative Suite (Premiere Pro, After Effects, Photoshop)</w:t>
+      </w:r>
+    </w:p>
+    <w:p>
+      <w:pPr>
+        <w:numPr>
+          <w:ilvl w:val="0"/>
+          <w:numId w:val="1002"/>
+        </w:numPr>
+        <w:pStyle w:val="Compact"/>
+      </w:pPr>
+      <w:r>
+        <w:t xml:space="preserve">Pro Tools</w:t>
+      </w:r>
+    </w:p>
+    <w:p>
+      <w:pPr>
+        <w:numPr>
+          <w:ilvl w:val="0"/>
+          <w:numId w:val="1002"/>
+        </w:numPr>
+        <w:pStyle w:val="Compact"/>
+      </w:pPr>
+      <w:r>
+        <w:t xml:space="preserve">Avid NEXUS / Interplay systems</w:t>
+      </w:r>
+    </w:p>
+    <w:p>
+      <w:pPr>
+        <w:numPr>
+          <w:ilvl w:val="0"/>
+          <w:numId w:val="1002"/>
+        </w:numPr>
+        <w:pStyle w:val="Compact"/>
+      </w:pPr>
+      <w:r>
+        <w:t xml:space="preserve">Media workflows, post-production pipelines, and compression</w:t>
+      </w:r>
+    </w:p>
+    <w:bookmarkEnd w:id="25"/>
     <w:sectPr/>
   </w:body>
 </w:document>
@@ -506,8 +704,90 @@
       </w:pPr>
     </w:lvl>
   </w:abstractNum>
+  <w:abstractNum w:abstractNumId="991">
+    <w:nsid w:val="A991"/>
+    <w:multiLevelType w:val="multilevel"/>
+    <w:lvl w:ilvl="0">
+      <w:numFmt w:val="bullet"/>
+      <w:lvlText w:val="•"/>
+      <w:lvlJc w:val="left"/>
+      <w:pPr>
+        <w:ind w:left="720" w:hanging="480"/>
+      </w:pPr>
+    </w:lvl>
+    <w:lvl w:ilvl="1">
+      <w:numFmt w:val="bullet"/>
+      <w:lvlText w:val="–"/>
+      <w:lvlJc w:val="left"/>
+      <w:pPr>
+        <w:ind w:left="1440" w:hanging="480"/>
+      </w:pPr>
+    </w:lvl>
+    <w:lvl w:ilvl="2">
+      <w:numFmt w:val="bullet"/>
+      <w:lvlText w:val="•"/>
+      <w:lvlJc w:val="left"/>
+      <w:pPr>
+        <w:ind w:left="2160" w:hanging="480"/>
+      </w:pPr>
+    </w:lvl>
+    <w:lvl w:ilvl="3">
+      <w:numFmt w:val="bullet"/>
+      <w:lvlText w:val="–"/>
+      <w:lvlJc w:val="left"/>
+      <w:pPr>
+        <w:ind w:left="2880" w:hanging="480"/>
+      </w:pPr>
+    </w:lvl>
+    <w:lvl w:ilvl="4">
+      <w:numFmt w:val="bullet"/>
+      <w:lvlText w:val="•"/>
+      <w:lvlJc w:val="left"/>
+      <w:pPr>
+        <w:ind w:left="3600" w:hanging="480"/>
+      </w:pPr>
+    </w:lvl>
+    <w:lvl w:ilvl="5">
+      <w:numFmt w:val="bullet"/>
+      <w:lvlText w:val="–"/>
+      <w:lvlJc w:val="left"/>
+      <w:pPr>
+        <w:ind w:left="4320" w:hanging="480"/>
+      </w:pPr>
+    </w:lvl>
+    <w:lvl w:ilvl="6">
+      <w:numFmt w:val="bullet"/>
+      <w:lvlText w:val="•"/>
+      <w:lvlJc w:val="left"/>
+      <w:pPr>
+        <w:ind w:left="5040" w:hanging="480"/>
+      </w:pPr>
+    </w:lvl>
+    <w:lvl w:ilvl="7">
+      <w:numFmt w:val="bullet"/>
+      <w:lvlText w:val="–"/>
+      <w:lvlJc w:val="left"/>
+      <w:pPr>
+        <w:ind w:left="5760" w:hanging="480"/>
+      </w:pPr>
+    </w:lvl>
+    <w:lvl w:ilvl="8">
+      <w:numFmt w:val="bullet"/>
+      <w:lvlText w:val="•"/>
+      <w:lvlJc w:val="left"/>
+      <w:pPr>
+        <w:ind w:left="6480" w:hanging="480"/>
+      </w:pPr>
+    </w:lvl>
+  </w:abstractNum>
   <w:num w:numId="1000">
     <w:abstractNumId w:val="990"/>
+  </w:num>
+  <w:num w:numId="1001">
+    <w:abstractNumId w:val="991"/>
+  </w:num>
+  <w:num w:numId="1002">
+    <w:abstractNumId w:val="991"/>
   </w:num>
 </w:numbering>
 </file>
@@ -998,7 +1278,7 @@
       <w:color w:themeColor="accent1" w:themeShade="BF" w:val="365F91"/>
     </w:rPr>
   </w:style>
-  <w:style w:type="paragraph" w:customStyle="1" w:styleId="SourceCode">
+  <w:style w:customStyle="1" w:styleId="SourceCode" w:type="paragraph">
     <w:name w:val="Source Code"/>
     <w:basedOn w:val="Normal"/>
     <w:link w:val="VerbatimChar"/>
@@ -1006,7 +1286,7 @@
       <w:wordWrap w:val="off"/>
     </w:pPr>
   </w:style>
-  <w:style w:type="character" w:customStyle="1" w:styleId="KeywordTok">
+  <w:style w:customStyle="1" w:styleId="KeywordTok" w:type="character">
     <w:name w:val="KeywordTok"/>
     <w:basedOn w:val="VerbatimChar"/>
     <w:rPr>
@@ -1014,77 +1294,77 @@
       <w:b/>
     </w:rPr>
   </w:style>
-  <w:style w:type="character" w:customStyle="1" w:styleId="DataTypeTok">
+  <w:style w:customStyle="1" w:styleId="DataTypeTok" w:type="character">
     <w:name w:val="DataTypeTok"/>
     <w:basedOn w:val="VerbatimChar"/>
     <w:rPr>
       <w:color w:val="902000"/>
     </w:rPr>
   </w:style>
-  <w:style w:type="character" w:customStyle="1" w:styleId="DecValTok">
+  <w:style w:customStyle="1" w:styleId="DecValTok" w:type="character">
     <w:name w:val="DecValTok"/>
     <w:basedOn w:val="VerbatimChar"/>
     <w:rPr>
       <w:color w:val="40a070"/>
     </w:rPr>
   </w:style>
-  <w:style w:type="character" w:customStyle="1" w:styleId="BaseNTok">
+  <w:style w:customStyle="1" w:styleId="BaseNTok" w:type="character">
     <w:name w:val="BaseNTok"/>
     <w:basedOn w:val="VerbatimChar"/>
     <w:rPr>
       <w:color w:val="40a070"/>
     </w:rPr>
   </w:style>
-  <w:style w:type="character" w:customStyle="1" w:styleId="FloatTok">
+  <w:style w:customStyle="1" w:styleId="FloatTok" w:type="character">
     <w:name w:val="FloatTok"/>
     <w:basedOn w:val="VerbatimChar"/>
     <w:rPr>
       <w:color w:val="40a070"/>
     </w:rPr>
   </w:style>
-  <w:style w:type="character" w:customStyle="1" w:styleId="ConstantTok">
+  <w:style w:customStyle="1" w:styleId="ConstantTok" w:type="character">
     <w:name w:val="ConstantTok"/>
     <w:basedOn w:val="VerbatimChar"/>
     <w:rPr>
       <w:color w:val="880000"/>
     </w:rPr>
   </w:style>
-  <w:style w:type="character" w:customStyle="1" w:styleId="CharTok">
+  <w:style w:customStyle="1" w:styleId="CharTok" w:type="character">
     <w:name w:val="CharTok"/>
     <w:basedOn w:val="VerbatimChar"/>
     <w:rPr>
       <w:color w:val="4070a0"/>
     </w:rPr>
   </w:style>
-  <w:style w:type="character" w:customStyle="1" w:styleId="SpecialCharTok">
+  <w:style w:customStyle="1" w:styleId="SpecialCharTok" w:type="character">
     <w:name w:val="SpecialCharTok"/>
     <w:basedOn w:val="VerbatimChar"/>
     <w:rPr>
       <w:color w:val="4070a0"/>
     </w:rPr>
   </w:style>
-  <w:style w:type="character" w:customStyle="1" w:styleId="StringTok">
+  <w:style w:customStyle="1" w:styleId="StringTok" w:type="character">
     <w:name w:val="StringTok"/>
     <w:basedOn w:val="VerbatimChar"/>
     <w:rPr>
       <w:color w:val="4070a0"/>
     </w:rPr>
   </w:style>
-  <w:style w:type="character" w:customStyle="1" w:styleId="VerbatimStringTok">
+  <w:style w:customStyle="1" w:styleId="VerbatimStringTok" w:type="character">
     <w:name w:val="VerbatimStringTok"/>
     <w:basedOn w:val="VerbatimChar"/>
     <w:rPr>
       <w:color w:val="4070a0"/>
     </w:rPr>
   </w:style>
-  <w:style w:type="character" w:customStyle="1" w:styleId="SpecialStringTok">
+  <w:style w:customStyle="1" w:styleId="SpecialStringTok" w:type="character">
     <w:name w:val="SpecialStringTok"/>
     <w:basedOn w:val="VerbatimChar"/>
     <w:rPr>
       <w:color w:val="bb6688"/>
     </w:rPr>
   </w:style>
-  <w:style w:type="character" w:customStyle="1" w:styleId="ImportTok">
+  <w:style w:customStyle="1" w:styleId="ImportTok" w:type="character">
     <w:name w:val="ImportTok"/>
     <w:basedOn w:val="VerbatimChar"/>
     <w:rPr>
@@ -1092,7 +1372,7 @@
       <w:b/>
     </w:rPr>
   </w:style>
-  <w:style w:type="character" w:customStyle="1" w:styleId="CommentTok">
+  <w:style w:customStyle="1" w:styleId="CommentTok" w:type="character">
     <w:name w:val="CommentTok"/>
     <w:basedOn w:val="VerbatimChar"/>
     <w:rPr>
@@ -1100,7 +1380,7 @@
       <w:i/>
     </w:rPr>
   </w:style>
-  <w:style w:type="character" w:customStyle="1" w:styleId="DocumentationTok">
+  <w:style w:customStyle="1" w:styleId="DocumentationTok" w:type="character">
     <w:name w:val="DocumentationTok"/>
     <w:basedOn w:val="VerbatimChar"/>
     <w:rPr>
@@ -1108,7 +1388,7 @@
       <w:i/>
     </w:rPr>
   </w:style>
-  <w:style w:type="character" w:customStyle="1" w:styleId="AnnotationTok">
+  <w:style w:customStyle="1" w:styleId="AnnotationTok" w:type="character">
     <w:name w:val="AnnotationTok"/>
     <w:basedOn w:val="VerbatimChar"/>
     <w:rPr>
@@ -1117,7 +1397,7 @@
       <w:i/>
     </w:rPr>
   </w:style>
-  <w:style w:type="character" w:customStyle="1" w:styleId="CommentVarTok">
+  <w:style w:customStyle="1" w:styleId="CommentVarTok" w:type="character">
     <w:name w:val="CommentVarTok"/>
     <w:basedOn w:val="VerbatimChar"/>
     <w:rPr>
@@ -1126,28 +1406,28 @@
       <w:i/>
     </w:rPr>
   </w:style>
-  <w:style w:type="character" w:customStyle="1" w:styleId="OtherTok">
+  <w:style w:customStyle="1" w:styleId="OtherTok" w:type="character">
     <w:name w:val="OtherTok"/>
     <w:basedOn w:val="VerbatimChar"/>
     <w:rPr>
       <w:color w:val="007020"/>
     </w:rPr>
   </w:style>
-  <w:style w:type="character" w:customStyle="1" w:styleId="FunctionTok">
+  <w:style w:customStyle="1" w:styleId="FunctionTok" w:type="character">
     <w:name w:val="FunctionTok"/>
     <w:basedOn w:val="VerbatimChar"/>
     <w:rPr>
       <w:color w:val="06287e"/>
     </w:rPr>
   </w:style>
-  <w:style w:type="character" w:customStyle="1" w:styleId="VariableTok">
+  <w:style w:customStyle="1" w:styleId="VariableTok" w:type="character">
     <w:name w:val="VariableTok"/>
     <w:basedOn w:val="VerbatimChar"/>
     <w:rPr>
       <w:color w:val="19177c"/>
     </w:rPr>
   </w:style>
-  <w:style w:type="character" w:customStyle="1" w:styleId="ControlFlowTok">
+  <w:style w:customStyle="1" w:styleId="ControlFlowTok" w:type="character">
     <w:name w:val="ControlFlowTok"/>
     <w:basedOn w:val="VerbatimChar"/>
     <w:rPr>
@@ -1155,45 +1435,45 @@
       <w:b/>
     </w:rPr>
   </w:style>
-  <w:style w:type="character" w:customStyle="1" w:styleId="OperatorTok">
+  <w:style w:customStyle="1" w:styleId="OperatorTok" w:type="character">
     <w:name w:val="OperatorTok"/>
     <w:basedOn w:val="VerbatimChar"/>
     <w:rPr>
       <w:color w:val="666666"/>
     </w:rPr>
   </w:style>
-  <w:style w:type="character" w:customStyle="1" w:styleId="BuiltInTok">
+  <w:style w:customStyle="1" w:styleId="BuiltInTok" w:type="character">
     <w:name w:val="BuiltInTok"/>
     <w:basedOn w:val="VerbatimChar"/>
     <w:rPr>
       <w:color w:val="008000"/>
     </w:rPr>
   </w:style>
-  <w:style w:type="character" w:customStyle="1" w:styleId="ExtensionTok">
+  <w:style w:customStyle="1" w:styleId="ExtensionTok" w:type="character">
     <w:name w:val="ExtensionTok"/>
     <w:basedOn w:val="VerbatimChar"/>
     <w:rPr/>
   </w:style>
-  <w:style w:type="character" w:customStyle="1" w:styleId="PreprocessorTok">
+  <w:style w:customStyle="1" w:styleId="PreprocessorTok" w:type="character">
     <w:name w:val="PreprocessorTok"/>
     <w:basedOn w:val="VerbatimChar"/>
     <w:rPr>
       <w:color w:val="bc7a00"/>
     </w:rPr>
   </w:style>
-  <w:style w:type="character" w:customStyle="1" w:styleId="AttributeTok">
+  <w:style w:customStyle="1" w:styleId="AttributeTok" w:type="character">
     <w:name w:val="AttributeTok"/>
     <w:basedOn w:val="VerbatimChar"/>
     <w:rPr>
       <w:color w:val="7d9029"/>
     </w:rPr>
   </w:style>
-  <w:style w:type="character" w:customStyle="1" w:styleId="RegionMarkerTok">
+  <w:style w:customStyle="1" w:styleId="RegionMarkerTok" w:type="character">
     <w:name w:val="RegionMarkerTok"/>
     <w:basedOn w:val="VerbatimChar"/>
     <w:rPr/>
   </w:style>
-  <w:style w:type="character" w:customStyle="1" w:styleId="InformationTok">
+  <w:style w:customStyle="1" w:styleId="InformationTok" w:type="character">
     <w:name w:val="InformationTok"/>
     <w:basedOn w:val="VerbatimChar"/>
     <w:rPr>
@@ -1202,7 +1482,7 @@
       <w:i/>
     </w:rPr>
   </w:style>
-  <w:style w:type="character" w:customStyle="1" w:styleId="WarningTok">
+  <w:style w:customStyle="1" w:styleId="WarningTok" w:type="character">
     <w:name w:val="WarningTok"/>
     <w:basedOn w:val="VerbatimChar"/>
     <w:rPr>
@@ -1211,7 +1491,7 @@
       <w:i/>
     </w:rPr>
   </w:style>
-  <w:style w:type="character" w:customStyle="1" w:styleId="AlertTok">
+  <w:style w:customStyle="1" w:styleId="AlertTok" w:type="character">
     <w:name w:val="AlertTok"/>
     <w:basedOn w:val="VerbatimChar"/>
     <w:rPr>
@@ -1219,7 +1499,7 @@
       <w:b/>
     </w:rPr>
   </w:style>
-  <w:style w:type="character" w:customStyle="1" w:styleId="ErrorTok">
+  <w:style w:customStyle="1" w:styleId="ErrorTok" w:type="character">
     <w:name w:val="ErrorTok"/>
     <w:basedOn w:val="VerbatimChar"/>
     <w:rPr>
@@ -1227,7 +1507,7 @@
       <w:b/>
     </w:rPr>
   </w:style>
-  <w:style w:type="character" w:customStyle="1" w:styleId="NormalTok">
+  <w:style w:customStyle="1" w:styleId="NormalTok" w:type="character">
     <w:name w:val="NormalTok"/>
     <w:basedOn w:val="VerbatimChar"/>
     <w:rPr/>

</xml_diff>

<commit_message>
Resume: update SUNY role progression (format preserved)
</commit_message>
<xml_diff>
--- a/assets/AD_Annas_Resume.docx
+++ b/assets/AD_Annas_Resume.docx
@@ -288,7 +288,18 @@
         <w:rPr>
           <w:b/>
         </w:rPr>
-        <w:t>SUNY Buffalo State University — Director, Television &amp; Film Arts Program / Associate Professor</w:t>
+        <w:t>SUNY Buffalo State University</w:t>
+      </w:r>
+    </w:p>
+    <w:p>
+      <w:pPr>
+        <w:spacing w:before="160" w:after="0" w:line="259" w:lineRule="auto"/>
+      </w:pPr>
+      <w:r>
+        <w:rPr>
+          <w:b/>
+        </w:rPr>
+        <w:t>Director, Television &amp; Film Arts Program / Associate Professor</w:t>
       </w:r>
     </w:p>
     <w:p>
@@ -299,7 +310,73 @@
         <w:rPr>
           <w:i/>
         </w:rPr>
-        <w:t>2018–2024</w:t>
+        <w:t>2020–2024</w:t>
+      </w:r>
+    </w:p>
+    <w:p>
+      <w:pPr>
+        <w:spacing w:before="0" w:after="40" w:line="259" w:lineRule="auto"/>
+      </w:pPr>
+      <w:r>
+        <w:rPr>
+          <w:i/>
+        </w:rPr>
+        <w:t/>
+      </w:r>
+    </w:p>
+    <w:p>
+      <w:pPr>
+        <w:spacing w:before="160" w:after="0" w:line="259" w:lineRule="auto"/>
+      </w:pPr>
+      <w:r>
+        <w:rPr>
+          <w:b/>
+        </w:rPr>
+        <w:t>Assistant Professor, Television &amp; Film Arts</w:t>
+      </w:r>
+    </w:p>
+    <w:p>
+      <w:pPr>
+        <w:spacing w:before="0" w:after="40" w:line="259" w:lineRule="auto"/>
+      </w:pPr>
+      <w:r>
+        <w:rPr>
+          <w:i/>
+        </w:rPr>
+        <w:t>2018–2020</w:t>
+      </w:r>
+    </w:p>
+    <w:p>
+      <w:pPr>
+        <w:spacing w:before="0" w:after="40" w:line="259" w:lineRule="auto"/>
+      </w:pPr>
+      <w:r>
+        <w:rPr>
+          <w:i/>
+        </w:rPr>
+        <w:t/>
+      </w:r>
+    </w:p>
+    <w:p>
+      <w:pPr>
+        <w:spacing w:before="160" w:after="0" w:line="259" w:lineRule="auto"/>
+      </w:pPr>
+      <w:r>
+        <w:rPr>
+          <w:b/>
+        </w:rPr>
+        <w:t>Assistant Professor, Media Production</w:t>
+      </w:r>
+    </w:p>
+    <w:p>
+      <w:pPr>
+        <w:spacing w:before="0" w:after="40" w:line="259" w:lineRule="auto"/>
+      </w:pPr>
+      <w:r>
+        <w:rPr>
+          <w:i/>
+        </w:rPr>
+        <w:t>2015–2018</w:t>
       </w:r>
     </w:p>
     <w:p>

</xml_diff>